<commit_message>
Homework questions added for Homework 4.1 and answers added in asnwer.docx
</commit_message>
<xml_diff>
--- a/WMC/answer1.docx
+++ b/WMC/answer1.docx
@@ -21662,6 +21662,2246 @@
     </w:p>
     <w:p>
       <w:pPr>
+        <w:ind w:left="-1560"/>
+        <w:rPr>
+          <w:sz w:val="32"/>
+          <w:szCs w:val="32"/>
+          <w:vertAlign w:val="superscript"/>
+          <w:lang w:val="en-IN"/>
+        </w:rPr>
+      </w:pPr>
+    </w:p>
+    <w:p>
+      <w:pPr>
+        <w:ind w:left="-1560"/>
+        <w:rPr>
+          <w:sz w:val="32"/>
+          <w:szCs w:val="32"/>
+          <w:vertAlign w:val="superscript"/>
+        </w:rPr>
+      </w:pPr>
+      <w:r>
+        <w:rPr>
+          <w:sz w:val="32"/>
+          <w:szCs w:val="32"/>
+          <w:vertAlign w:val="superscript"/>
+        </w:rPr>
+        <w:t xml:space="preserve">4.1 If </w:t>
+      </w:r>
+      <m:oMath>
+        <m:sSub>
+          <m:sSubPr>
+            <m:ctrlPr>
+              <w:rPr>
+                <w:rFonts w:ascii="Cambria Math" w:hAnsi="Cambria Math"/>
+                <w:i/>
+                <w:iCs/>
+                <w:sz w:val="32"/>
+                <w:szCs w:val="32"/>
+                <w:vertAlign w:val="superscript"/>
+              </w:rPr>
+            </m:ctrlPr>
+          </m:sSubPr>
+          <m:e>
+            <m:r>
+              <w:rPr>
+                <w:rFonts w:ascii="Cambria Math" w:hAnsi="Cambria Math"/>
+                <w:sz w:val="32"/>
+                <w:szCs w:val="32"/>
+                <w:vertAlign w:val="superscript"/>
+              </w:rPr>
+              <m:t>P</m:t>
+            </m:r>
+          </m:e>
+          <m:sub>
+            <m:r>
+              <w:rPr>
+                <w:rFonts w:ascii="Cambria Math" w:hAnsi="Cambria Math"/>
+                <w:sz w:val="32"/>
+                <w:szCs w:val="32"/>
+                <w:vertAlign w:val="superscript"/>
+              </w:rPr>
+              <m:t>t</m:t>
+            </m:r>
+          </m:sub>
+        </m:sSub>
+      </m:oMath>
+      <w:r>
+        <w:rPr>
+          <w:sz w:val="32"/>
+          <w:szCs w:val="32"/>
+          <w:vertAlign w:val="superscript"/>
+          <w:rtl/>
+          <w:lang w:val="en-IN" w:bidi="ar-AE"/>
+        </w:rPr>
+        <w:t xml:space="preserve"> = </w:t>
+      </w:r>
+      <w:r>
+        <w:rPr>
+          <w:sz w:val="32"/>
+          <w:szCs w:val="32"/>
+          <w:vertAlign w:val="superscript"/>
+        </w:rPr>
+        <w:t xml:space="preserve"> 10</w:t>
+      </w:r>
+      <w:r>
+        <w:rPr>
+          <w:sz w:val="32"/>
+          <w:szCs w:val="32"/>
+          <w:vertAlign w:val="superscript"/>
+          <w:rtl/>
+          <w:lang w:val="en-IN" w:bidi="ar-AE"/>
+        </w:rPr>
+        <w:t xml:space="preserve"> </w:t>
+      </w:r>
+      <w:r>
+        <w:rPr>
+          <w:sz w:val="32"/>
+          <w:szCs w:val="32"/>
+          <w:vertAlign w:val="superscript"/>
+        </w:rPr>
+        <w:t xml:space="preserve">W , </w:t>
+      </w:r>
+      <m:oMath>
+        <m:sSub>
+          <m:sSubPr>
+            <m:ctrlPr>
+              <w:rPr>
+                <w:rFonts w:ascii="Cambria Math" w:hAnsi="Cambria Math"/>
+                <w:i/>
+                <w:iCs/>
+                <w:sz w:val="32"/>
+                <w:szCs w:val="32"/>
+                <w:vertAlign w:val="superscript"/>
+              </w:rPr>
+            </m:ctrlPr>
+          </m:sSubPr>
+          <m:e>
+            <m:r>
+              <w:rPr>
+                <w:rFonts w:ascii="Cambria Math" w:hAnsi="Cambria Math"/>
+                <w:sz w:val="32"/>
+                <w:szCs w:val="32"/>
+                <w:vertAlign w:val="superscript"/>
+              </w:rPr>
+              <m:t>G</m:t>
+            </m:r>
+          </m:e>
+          <m:sub>
+            <m:r>
+              <w:rPr>
+                <w:rFonts w:ascii="Cambria Math" w:hAnsi="Cambria Math"/>
+                <w:sz w:val="32"/>
+                <w:szCs w:val="32"/>
+                <w:vertAlign w:val="superscript"/>
+              </w:rPr>
+              <m:t>t</m:t>
+            </m:r>
+          </m:sub>
+        </m:sSub>
+      </m:oMath>
+      <w:r>
+        <w:rPr>
+          <w:sz w:val="32"/>
+          <w:szCs w:val="32"/>
+          <w:vertAlign w:val="superscript"/>
+        </w:rPr>
+        <w:t xml:space="preserve">, = 0 dB, </w:t>
+      </w:r>
+      <m:oMath>
+        <m:sSub>
+          <m:sSubPr>
+            <m:ctrlPr>
+              <w:rPr>
+                <w:rFonts w:ascii="Cambria Math" w:hAnsi="Cambria Math"/>
+                <w:i/>
+                <w:iCs/>
+                <w:sz w:val="32"/>
+                <w:szCs w:val="32"/>
+                <w:vertAlign w:val="superscript"/>
+              </w:rPr>
+            </m:ctrlPr>
+          </m:sSubPr>
+          <m:e>
+            <m:r>
+              <w:rPr>
+                <w:rFonts w:ascii="Cambria Math" w:hAnsi="Cambria Math"/>
+                <w:sz w:val="32"/>
+                <w:szCs w:val="32"/>
+                <w:vertAlign w:val="superscript"/>
+              </w:rPr>
+              <m:t>G</m:t>
+            </m:r>
+          </m:e>
+          <m:sub>
+            <m:r>
+              <w:rPr>
+                <w:rFonts w:ascii="Cambria Math" w:hAnsi="Cambria Math"/>
+                <w:sz w:val="32"/>
+                <w:szCs w:val="32"/>
+                <w:vertAlign w:val="superscript"/>
+              </w:rPr>
+              <m:t>r</m:t>
+            </m:r>
+          </m:sub>
+        </m:sSub>
+      </m:oMath>
+      <w:r>
+        <w:rPr>
+          <w:sz w:val="32"/>
+          <w:szCs w:val="32"/>
+          <w:vertAlign w:val="superscript"/>
+        </w:rPr>
+        <w:t xml:space="preserve"> = 0 dB, and.</w:t>
+      </w:r>
+      <w:r>
+        <w:rPr>
+          <w:sz w:val="32"/>
+          <w:szCs w:val="32"/>
+          <w:vertAlign w:val="superscript"/>
+          <w:rtl/>
+          <w:lang w:val="en-IN" w:bidi="ar-AE"/>
+        </w:rPr>
+        <w:t xml:space="preserve"> </w:t>
+      </w:r>
+      <m:oMath>
+        <m:sSub>
+          <m:sSubPr>
+            <m:ctrlPr>
+              <w:rPr>
+                <w:rFonts w:ascii="Cambria Math" w:hAnsi="Cambria Math"/>
+                <w:i/>
+                <w:iCs/>
+                <w:sz w:val="32"/>
+                <w:szCs w:val="32"/>
+                <w:vertAlign w:val="superscript"/>
+              </w:rPr>
+            </m:ctrlPr>
+          </m:sSubPr>
+          <m:e>
+            <m:r>
+              <w:rPr>
+                <w:rFonts w:ascii="Cambria Math" w:hAnsi="Cambria Math"/>
+                <w:sz w:val="32"/>
+                <w:szCs w:val="32"/>
+                <w:vertAlign w:val="superscript"/>
+              </w:rPr>
+              <m:t>f</m:t>
+            </m:r>
+          </m:e>
+          <m:sub>
+            <m:r>
+              <w:rPr>
+                <w:rFonts w:ascii="Cambria Math" w:hAnsi="Cambria Math"/>
+                <w:sz w:val="32"/>
+                <w:szCs w:val="32"/>
+                <w:vertAlign w:val="superscript"/>
+              </w:rPr>
+              <m:t>c</m:t>
+            </m:r>
+          </m:sub>
+        </m:sSub>
+      </m:oMath>
+      <w:r>
+        <w:rPr>
+          <w:sz w:val="32"/>
+          <w:szCs w:val="32"/>
+          <w:vertAlign w:val="superscript"/>
+        </w:rPr>
+        <w:t xml:space="preserve"> = 900 MHz, find </w:t>
+      </w:r>
+      <m:oMath>
+        <m:sSub>
+          <m:sSubPr>
+            <m:ctrlPr>
+              <w:rPr>
+                <w:rFonts w:ascii="Cambria Math" w:hAnsi="Cambria Math"/>
+                <w:i/>
+                <w:iCs/>
+                <w:sz w:val="32"/>
+                <w:szCs w:val="32"/>
+                <w:vertAlign w:val="superscript"/>
+              </w:rPr>
+            </m:ctrlPr>
+          </m:sSubPr>
+          <m:e>
+            <m:r>
+              <w:rPr>
+                <w:rFonts w:ascii="Cambria Math" w:hAnsi="Cambria Math"/>
+                <w:sz w:val="32"/>
+                <w:szCs w:val="32"/>
+                <w:vertAlign w:val="superscript"/>
+              </w:rPr>
+              <m:t>P</m:t>
+            </m:r>
+          </m:e>
+          <m:sub>
+            <m:r>
+              <w:rPr>
+                <w:rFonts w:ascii="Cambria Math" w:hAnsi="Cambria Math"/>
+                <w:sz w:val="32"/>
+                <w:szCs w:val="32"/>
+                <w:vertAlign w:val="superscript"/>
+              </w:rPr>
+              <m:t>r</m:t>
+            </m:r>
+          </m:sub>
+        </m:sSub>
+      </m:oMath>
+      <w:r>
+        <w:rPr>
+          <w:sz w:val="32"/>
+          <w:szCs w:val="32"/>
+          <w:vertAlign w:val="superscript"/>
+        </w:rPr>
+        <w:t xml:space="preserve"> in Watts at a free space distance of 1 km</w:t>
+      </w:r>
+    </w:p>
+    <w:p>
+      <w:pPr>
+        <w:ind w:left="-1560"/>
+        <w:rPr>
+          <w:sz w:val="32"/>
+          <w:szCs w:val="32"/>
+          <w:vertAlign w:val="superscript"/>
+          <w:lang w:val="en-IN"/>
+        </w:rPr>
+      </w:pPr>
+      <w:r>
+        <w:rPr>
+          <w:noProof/>
+        </w:rPr>
+        <w:drawing>
+          <wp:inline distT="0" distB="0" distL="0" distR="0" wp14:anchorId="1AA60D6A" wp14:editId="28C0DDE9">
+            <wp:extent cx="5486400" cy="2611120"/>
+            <wp:effectExtent l="0" t="0" r="0" b="0"/>
+            <wp:docPr id="104255471" name="Picture 1"/>
+            <wp:cNvGraphicFramePr>
+              <a:graphicFrameLocks xmlns:a="http://schemas.openxmlformats.org/drawingml/2006/main" noChangeAspect="1"/>
+            </wp:cNvGraphicFramePr>
+            <a:graphic xmlns:a="http://schemas.openxmlformats.org/drawingml/2006/main">
+              <a:graphicData uri="http://schemas.openxmlformats.org/drawingml/2006/picture">
+                <pic:pic xmlns:pic="http://schemas.openxmlformats.org/drawingml/2006/picture">
+                  <pic:nvPicPr>
+                    <pic:cNvPr id="104255471" name=""/>
+                    <pic:cNvPicPr/>
+                  </pic:nvPicPr>
+                  <pic:blipFill>
+                    <a:blip r:embed="rId32"/>
+                    <a:stretch>
+                      <a:fillRect/>
+                    </a:stretch>
+                  </pic:blipFill>
+                  <pic:spPr>
+                    <a:xfrm>
+                      <a:off x="0" y="0"/>
+                      <a:ext cx="5486400" cy="2611120"/>
+                    </a:xfrm>
+                    <a:prstGeom prst="rect">
+                      <a:avLst/>
+                    </a:prstGeom>
+                  </pic:spPr>
+                </pic:pic>
+              </a:graphicData>
+            </a:graphic>
+          </wp:inline>
+        </w:drawing>
+      </w:r>
+    </w:p>
+    <w:p>
+      <w:pPr>
+        <w:ind w:left="-1560"/>
+        <w:rPr>
+          <w:sz w:val="32"/>
+          <w:szCs w:val="32"/>
+          <w:vertAlign w:val="superscript"/>
+          <w:lang w:val="en-IN"/>
+        </w:rPr>
+      </w:pPr>
+      <w:r>
+        <w:rPr>
+          <w:noProof/>
+        </w:rPr>
+        <w:drawing>
+          <wp:inline distT="0" distB="0" distL="0" distR="0" wp14:anchorId="686EE5F9" wp14:editId="51589938">
+            <wp:extent cx="5486400" cy="2677795"/>
+            <wp:effectExtent l="0" t="0" r="0" b="8255"/>
+            <wp:docPr id="2079793221" name="Picture 1"/>
+            <wp:cNvGraphicFramePr>
+              <a:graphicFrameLocks xmlns:a="http://schemas.openxmlformats.org/drawingml/2006/main" noChangeAspect="1"/>
+            </wp:cNvGraphicFramePr>
+            <a:graphic xmlns:a="http://schemas.openxmlformats.org/drawingml/2006/main">
+              <a:graphicData uri="http://schemas.openxmlformats.org/drawingml/2006/picture">
+                <pic:pic xmlns:pic="http://schemas.openxmlformats.org/drawingml/2006/picture">
+                  <pic:nvPicPr>
+                    <pic:cNvPr id="2079793221" name=""/>
+                    <pic:cNvPicPr/>
+                  </pic:nvPicPr>
+                  <pic:blipFill>
+                    <a:blip r:embed="rId33"/>
+                    <a:stretch>
+                      <a:fillRect/>
+                    </a:stretch>
+                  </pic:blipFill>
+                  <pic:spPr>
+                    <a:xfrm>
+                      <a:off x="0" y="0"/>
+                      <a:ext cx="5486400" cy="2677795"/>
+                    </a:xfrm>
+                    <a:prstGeom prst="rect">
+                      <a:avLst/>
+                    </a:prstGeom>
+                  </pic:spPr>
+                </pic:pic>
+              </a:graphicData>
+            </a:graphic>
+          </wp:inline>
+        </w:drawing>
+      </w:r>
+    </w:p>
+    <w:p>
+      <w:pPr>
+        <w:ind w:left="-1560"/>
+        <w:rPr>
+          <w:sz w:val="32"/>
+          <w:szCs w:val="32"/>
+          <w:vertAlign w:val="superscript"/>
+          <w:lang w:val="en-IN"/>
+        </w:rPr>
+      </w:pPr>
+    </w:p>
+    <w:p>
+      <w:pPr>
+        <w:ind w:left="-1560"/>
+        <w:rPr>
+          <w:sz w:val="32"/>
+          <w:szCs w:val="32"/>
+          <w:vertAlign w:val="superscript"/>
+          <w:lang w:val="en-IN"/>
+        </w:rPr>
+      </w:pPr>
+      <w:r>
+        <w:rPr>
+          <w:noProof/>
+        </w:rPr>
+        <w:lastRenderedPageBreak/>
+        <w:drawing>
+          <wp:inline distT="0" distB="0" distL="0" distR="0" wp14:anchorId="2FF14657" wp14:editId="3E5F3F3A">
+            <wp:extent cx="5486400" cy="987425"/>
+            <wp:effectExtent l="0" t="0" r="0" b="3175"/>
+            <wp:docPr id="503818554" name="Picture 1"/>
+            <wp:cNvGraphicFramePr>
+              <a:graphicFrameLocks xmlns:a="http://schemas.openxmlformats.org/drawingml/2006/main" noChangeAspect="1"/>
+            </wp:cNvGraphicFramePr>
+            <a:graphic xmlns:a="http://schemas.openxmlformats.org/drawingml/2006/main">
+              <a:graphicData uri="http://schemas.openxmlformats.org/drawingml/2006/picture">
+                <pic:pic xmlns:pic="http://schemas.openxmlformats.org/drawingml/2006/picture">
+                  <pic:nvPicPr>
+                    <pic:cNvPr id="503818554" name=""/>
+                    <pic:cNvPicPr/>
+                  </pic:nvPicPr>
+                  <pic:blipFill>
+                    <a:blip r:embed="rId34"/>
+                    <a:stretch>
+                      <a:fillRect/>
+                    </a:stretch>
+                  </pic:blipFill>
+                  <pic:spPr>
+                    <a:xfrm>
+                      <a:off x="0" y="0"/>
+                      <a:ext cx="5486400" cy="987425"/>
+                    </a:xfrm>
+                    <a:prstGeom prst="rect">
+                      <a:avLst/>
+                    </a:prstGeom>
+                  </pic:spPr>
+                </pic:pic>
+              </a:graphicData>
+            </a:graphic>
+          </wp:inline>
+        </w:drawing>
+      </w:r>
+    </w:p>
+    <w:p>
+      <w:pPr>
+        <w:ind w:left="-1560"/>
+        <w:rPr>
+          <w:sz w:val="32"/>
+          <w:szCs w:val="32"/>
+          <w:vertAlign w:val="superscript"/>
+          <w:lang w:val="en-IN"/>
+        </w:rPr>
+      </w:pPr>
+    </w:p>
+    <w:p>
+      <w:pPr>
+        <w:ind w:left="-1560"/>
+        <w:rPr>
+          <w:sz w:val="32"/>
+          <w:szCs w:val="32"/>
+          <w:vertAlign w:val="superscript"/>
+          <w:lang w:val="en-IN"/>
+        </w:rPr>
+      </w:pPr>
+      <w:r>
+        <w:rPr>
+          <w:sz w:val="32"/>
+          <w:szCs w:val="32"/>
+          <w:vertAlign w:val="superscript"/>
+          <w:lang w:val="en-IN"/>
+        </w:rPr>
+        <w:t xml:space="preserve">4.2 Assume a receiver is located 10 km from a 50 W transmitter. The carrier frequency is 6 GHz and free space propagation is assumed, </w:t>
+      </w:r>
+      <m:oMath>
+        <m:sSub>
+          <m:sSubPr>
+            <m:ctrlPr>
+              <w:rPr>
+                <w:rFonts w:ascii="Cambria Math" w:hAnsi="Cambria Math"/>
+                <w:i/>
+                <w:iCs/>
+                <w:sz w:val="32"/>
+                <w:szCs w:val="32"/>
+                <w:vertAlign w:val="superscript"/>
+                <w:lang w:val="en-IN"/>
+              </w:rPr>
+            </m:ctrlPr>
+          </m:sSubPr>
+          <m:e>
+            <m:r>
+              <w:rPr>
+                <w:rFonts w:ascii="Cambria Math" w:hAnsi="Cambria Math"/>
+                <w:sz w:val="32"/>
+                <w:szCs w:val="32"/>
+                <w:vertAlign w:val="superscript"/>
+              </w:rPr>
+              <m:t>G</m:t>
+            </m:r>
+          </m:e>
+          <m:sub>
+            <m:r>
+              <w:rPr>
+                <w:rFonts w:ascii="Cambria Math" w:hAnsi="Cambria Math"/>
+                <w:sz w:val="32"/>
+                <w:szCs w:val="32"/>
+                <w:vertAlign w:val="superscript"/>
+              </w:rPr>
+              <m:t>t</m:t>
+            </m:r>
+          </m:sub>
+        </m:sSub>
+      </m:oMath>
+      <w:r>
+        <w:rPr>
+          <w:sz w:val="32"/>
+          <w:szCs w:val="32"/>
+          <w:vertAlign w:val="superscript"/>
+          <w:lang w:val="en-IN"/>
+        </w:rPr>
+        <w:t xml:space="preserve"> = 1 and </w:t>
+      </w:r>
+      <m:oMath>
+        <m:sSub>
+          <m:sSubPr>
+            <m:ctrlPr>
+              <w:rPr>
+                <w:rFonts w:ascii="Cambria Math" w:hAnsi="Cambria Math"/>
+                <w:i/>
+                <w:iCs/>
+                <w:sz w:val="32"/>
+                <w:szCs w:val="32"/>
+                <w:vertAlign w:val="superscript"/>
+                <w:lang w:val="en-IN"/>
+              </w:rPr>
+            </m:ctrlPr>
+          </m:sSubPr>
+          <m:e>
+            <m:r>
+              <w:rPr>
+                <w:rFonts w:ascii="Cambria Math" w:hAnsi="Cambria Math"/>
+                <w:sz w:val="32"/>
+                <w:szCs w:val="32"/>
+                <w:vertAlign w:val="superscript"/>
+              </w:rPr>
+              <m:t>G</m:t>
+            </m:r>
+          </m:e>
+          <m:sub>
+            <m:r>
+              <w:rPr>
+                <w:rFonts w:ascii="Cambria Math" w:hAnsi="Cambria Math"/>
+                <w:sz w:val="32"/>
+                <w:szCs w:val="32"/>
+                <w:vertAlign w:val="superscript"/>
+              </w:rPr>
+              <m:t>r</m:t>
+            </m:r>
+          </m:sub>
+        </m:sSub>
+      </m:oMath>
+      <w:r>
+        <w:rPr>
+          <w:sz w:val="32"/>
+          <w:szCs w:val="32"/>
+          <w:vertAlign w:val="superscript"/>
+          <w:lang w:val="en-IN"/>
+        </w:rPr>
+        <w:t xml:space="preserve"> = 1. </w:t>
+      </w:r>
+    </w:p>
+    <w:p>
+      <w:pPr>
+        <w:numPr>
+          <w:ilvl w:val="0"/>
+          <w:numId w:val="58"/>
+        </w:numPr>
+        <w:rPr>
+          <w:sz w:val="32"/>
+          <w:szCs w:val="32"/>
+          <w:vertAlign w:val="superscript"/>
+          <w:lang w:val="en-IN"/>
+        </w:rPr>
+      </w:pPr>
+      <w:r>
+        <w:rPr>
+          <w:sz w:val="32"/>
+          <w:szCs w:val="32"/>
+          <w:vertAlign w:val="superscript"/>
+          <w:lang w:val="en-IN"/>
+        </w:rPr>
+        <w:t xml:space="preserve">Find the power at the receiver. </w:t>
+      </w:r>
+    </w:p>
+    <w:p>
+      <w:pPr>
+        <w:numPr>
+          <w:ilvl w:val="0"/>
+          <w:numId w:val="58"/>
+        </w:numPr>
+        <w:rPr>
+          <w:sz w:val="32"/>
+          <w:szCs w:val="32"/>
+          <w:vertAlign w:val="superscript"/>
+          <w:lang w:val="en-IN"/>
+        </w:rPr>
+      </w:pPr>
+      <w:r>
+        <w:rPr>
+          <w:sz w:val="32"/>
+          <w:szCs w:val="32"/>
+          <w:vertAlign w:val="superscript"/>
+          <w:lang w:val="en-IN"/>
+        </w:rPr>
+        <w:t xml:space="preserve">Find the magnitude of the E-field at the receiver antenna. </w:t>
+      </w:r>
+    </w:p>
+    <w:p>
+      <w:pPr>
+        <w:numPr>
+          <w:ilvl w:val="0"/>
+          <w:numId w:val="58"/>
+        </w:numPr>
+        <w:rPr>
+          <w:sz w:val="32"/>
+          <w:szCs w:val="32"/>
+          <w:vertAlign w:val="superscript"/>
+          <w:lang w:val="en-IN"/>
+        </w:rPr>
+      </w:pPr>
+      <w:r>
+        <w:rPr>
+          <w:sz w:val="32"/>
+          <w:szCs w:val="32"/>
+          <w:vertAlign w:val="superscript"/>
+          <w:lang w:val="en-IN"/>
+        </w:rPr>
+        <w:t xml:space="preserve">Find the rms voltage applied to the receiver input, assuming that the receiver antenna has a purely real impedance of 50 </w:t>
+      </w:r>
+      <w:r>
+        <w:rPr>
+          <w:sz w:val="32"/>
+          <w:szCs w:val="32"/>
+          <w:vertAlign w:val="superscript"/>
+          <w:lang w:val="el-GR"/>
+        </w:rPr>
+        <w:t>Ω .</w:t>
+      </w:r>
+      <w:r>
+        <w:rPr>
+          <w:sz w:val="32"/>
+          <w:szCs w:val="32"/>
+          <w:vertAlign w:val="superscript"/>
+          <w:lang w:val="en-IN"/>
+        </w:rPr>
+        <w:t xml:space="preserve">Q and is matched to the receiver.  </w:t>
+      </w:r>
+    </w:p>
+    <w:p>
+      <w:pPr>
+        <w:ind w:left="-1560"/>
+        <w:rPr>
+          <w:sz w:val="32"/>
+          <w:szCs w:val="32"/>
+          <w:vertAlign w:val="superscript"/>
+          <w:lang w:val="en-IN"/>
+        </w:rPr>
+      </w:pPr>
+      <w:r>
+        <w:rPr>
+          <w:noProof/>
+        </w:rPr>
+        <w:drawing>
+          <wp:inline distT="0" distB="0" distL="0" distR="0" wp14:anchorId="2EEA3FFF" wp14:editId="4DBFDCC5">
+            <wp:extent cx="5486400" cy="2969260"/>
+            <wp:effectExtent l="0" t="0" r="0" b="2540"/>
+            <wp:docPr id="636115099" name="Picture 1"/>
+            <wp:cNvGraphicFramePr>
+              <a:graphicFrameLocks xmlns:a="http://schemas.openxmlformats.org/drawingml/2006/main" noChangeAspect="1"/>
+            </wp:cNvGraphicFramePr>
+            <a:graphic xmlns:a="http://schemas.openxmlformats.org/drawingml/2006/main">
+              <a:graphicData uri="http://schemas.openxmlformats.org/drawingml/2006/picture">
+                <pic:pic xmlns:pic="http://schemas.openxmlformats.org/drawingml/2006/picture">
+                  <pic:nvPicPr>
+                    <pic:cNvPr id="636115099" name=""/>
+                    <pic:cNvPicPr/>
+                  </pic:nvPicPr>
+                  <pic:blipFill>
+                    <a:blip r:embed="rId35"/>
+                    <a:stretch>
+                      <a:fillRect/>
+                    </a:stretch>
+                  </pic:blipFill>
+                  <pic:spPr>
+                    <a:xfrm>
+                      <a:off x="0" y="0"/>
+                      <a:ext cx="5486400" cy="2969260"/>
+                    </a:xfrm>
+                    <a:prstGeom prst="rect">
+                      <a:avLst/>
+                    </a:prstGeom>
+                  </pic:spPr>
+                </pic:pic>
+              </a:graphicData>
+            </a:graphic>
+          </wp:inline>
+        </w:drawing>
+      </w:r>
+    </w:p>
+    <w:p>
+      <w:pPr>
+        <w:ind w:left="-1560"/>
+        <w:rPr>
+          <w:sz w:val="32"/>
+          <w:szCs w:val="32"/>
+          <w:vertAlign w:val="superscript"/>
+          <w:lang w:val="en-IN"/>
+        </w:rPr>
+      </w:pPr>
+      <w:r>
+        <w:rPr>
+          <w:noProof/>
+        </w:rPr>
+        <w:lastRenderedPageBreak/>
+        <w:drawing>
+          <wp:inline distT="0" distB="0" distL="0" distR="0" wp14:anchorId="00E00983" wp14:editId="634D9D53">
+            <wp:extent cx="5486400" cy="3565525"/>
+            <wp:effectExtent l="0" t="0" r="0" b="0"/>
+            <wp:docPr id="1420512826" name="Picture 1"/>
+            <wp:cNvGraphicFramePr>
+              <a:graphicFrameLocks xmlns:a="http://schemas.openxmlformats.org/drawingml/2006/main" noChangeAspect="1"/>
+            </wp:cNvGraphicFramePr>
+            <a:graphic xmlns:a="http://schemas.openxmlformats.org/drawingml/2006/main">
+              <a:graphicData uri="http://schemas.openxmlformats.org/drawingml/2006/picture">
+                <pic:pic xmlns:pic="http://schemas.openxmlformats.org/drawingml/2006/picture">
+                  <pic:nvPicPr>
+                    <pic:cNvPr id="1420512826" name=""/>
+                    <pic:cNvPicPr/>
+                  </pic:nvPicPr>
+                  <pic:blipFill>
+                    <a:blip r:embed="rId36"/>
+                    <a:stretch>
+                      <a:fillRect/>
+                    </a:stretch>
+                  </pic:blipFill>
+                  <pic:spPr>
+                    <a:xfrm>
+                      <a:off x="0" y="0"/>
+                      <a:ext cx="5486400" cy="3565525"/>
+                    </a:xfrm>
+                    <a:prstGeom prst="rect">
+                      <a:avLst/>
+                    </a:prstGeom>
+                  </pic:spPr>
+                </pic:pic>
+              </a:graphicData>
+            </a:graphic>
+          </wp:inline>
+        </w:drawing>
+      </w:r>
+    </w:p>
+    <w:p>
+      <w:pPr>
+        <w:ind w:left="-1560"/>
+        <w:rPr>
+          <w:sz w:val="32"/>
+          <w:szCs w:val="32"/>
+          <w:vertAlign w:val="superscript"/>
+          <w:lang w:val="en-IN"/>
+        </w:rPr>
+      </w:pPr>
+    </w:p>
+    <w:p>
+      <w:pPr>
+        <w:ind w:left="-1560"/>
+        <w:rPr>
+          <w:sz w:val="32"/>
+          <w:szCs w:val="32"/>
+          <w:vertAlign w:val="superscript"/>
+          <w:lang w:val="en-IN"/>
+        </w:rPr>
+      </w:pPr>
+      <w:r>
+        <w:rPr>
+          <w:noProof/>
+        </w:rPr>
+        <w:drawing>
+          <wp:inline distT="0" distB="0" distL="0" distR="0" wp14:anchorId="12DD1584" wp14:editId="3B1D05B5">
+            <wp:extent cx="5486400" cy="1968500"/>
+            <wp:effectExtent l="0" t="0" r="0" b="0"/>
+            <wp:docPr id="218228444" name="Picture 1"/>
+            <wp:cNvGraphicFramePr>
+              <a:graphicFrameLocks xmlns:a="http://schemas.openxmlformats.org/drawingml/2006/main" noChangeAspect="1"/>
+            </wp:cNvGraphicFramePr>
+            <a:graphic xmlns:a="http://schemas.openxmlformats.org/drawingml/2006/main">
+              <a:graphicData uri="http://schemas.openxmlformats.org/drawingml/2006/picture">
+                <pic:pic xmlns:pic="http://schemas.openxmlformats.org/drawingml/2006/picture">
+                  <pic:nvPicPr>
+                    <pic:cNvPr id="218228444" name=""/>
+                    <pic:cNvPicPr/>
+                  </pic:nvPicPr>
+                  <pic:blipFill>
+                    <a:blip r:embed="rId37"/>
+                    <a:stretch>
+                      <a:fillRect/>
+                    </a:stretch>
+                  </pic:blipFill>
+                  <pic:spPr>
+                    <a:xfrm>
+                      <a:off x="0" y="0"/>
+                      <a:ext cx="5486400" cy="1968500"/>
+                    </a:xfrm>
+                    <a:prstGeom prst="rect">
+                      <a:avLst/>
+                    </a:prstGeom>
+                  </pic:spPr>
+                </pic:pic>
+              </a:graphicData>
+            </a:graphic>
+          </wp:inline>
+        </w:drawing>
+      </w:r>
+    </w:p>
+    <w:p>
+      <w:pPr>
+        <w:ind w:left="-1560"/>
+        <w:rPr>
+          <w:sz w:val="32"/>
+          <w:szCs w:val="32"/>
+          <w:vertAlign w:val="superscript"/>
+          <w:lang w:val="en-IN"/>
+        </w:rPr>
+      </w:pPr>
+    </w:p>
+    <w:p>
+      <w:pPr>
+        <w:ind w:left="-1560"/>
+        <w:rPr>
+          <w:sz w:val="32"/>
+          <w:szCs w:val="32"/>
+          <w:vertAlign w:val="superscript"/>
+          <w:lang w:val="en-IN"/>
+        </w:rPr>
+      </w:pPr>
+      <w:r>
+        <w:rPr>
+          <w:noProof/>
+        </w:rPr>
+        <w:drawing>
+          <wp:inline distT="0" distB="0" distL="0" distR="0" wp14:anchorId="28EB1DE2" wp14:editId="5CE863EF">
+            <wp:extent cx="5486400" cy="1591945"/>
+            <wp:effectExtent l="0" t="0" r="0" b="8255"/>
+            <wp:docPr id="662113750" name="Picture 1"/>
+            <wp:cNvGraphicFramePr>
+              <a:graphicFrameLocks xmlns:a="http://schemas.openxmlformats.org/drawingml/2006/main" noChangeAspect="1"/>
+            </wp:cNvGraphicFramePr>
+            <a:graphic xmlns:a="http://schemas.openxmlformats.org/drawingml/2006/main">
+              <a:graphicData uri="http://schemas.openxmlformats.org/drawingml/2006/picture">
+                <pic:pic xmlns:pic="http://schemas.openxmlformats.org/drawingml/2006/picture">
+                  <pic:nvPicPr>
+                    <pic:cNvPr id="662113750" name=""/>
+                    <pic:cNvPicPr/>
+                  </pic:nvPicPr>
+                  <pic:blipFill>
+                    <a:blip r:embed="rId38"/>
+                    <a:stretch>
+                      <a:fillRect/>
+                    </a:stretch>
+                  </pic:blipFill>
+                  <pic:spPr>
+                    <a:xfrm>
+                      <a:off x="0" y="0"/>
+                      <a:ext cx="5486400" cy="1591945"/>
+                    </a:xfrm>
+                    <a:prstGeom prst="rect">
+                      <a:avLst/>
+                    </a:prstGeom>
+                  </pic:spPr>
+                </pic:pic>
+              </a:graphicData>
+            </a:graphic>
+          </wp:inline>
+        </w:drawing>
+      </w:r>
+    </w:p>
+    <w:p>
+      <w:pPr>
+        <w:ind w:left="-1560"/>
+        <w:rPr>
+          <w:sz w:val="32"/>
+          <w:szCs w:val="32"/>
+          <w:vertAlign w:val="superscript"/>
+          <w:lang w:val="en-IN"/>
+        </w:rPr>
+      </w:pPr>
+    </w:p>
+    <w:p>
+      <w:pPr>
+        <w:ind w:left="-1560"/>
+        <w:rPr>
+          <w:sz w:val="32"/>
+          <w:szCs w:val="32"/>
+          <w:vertAlign w:val="superscript"/>
+          <w:lang w:val="en-IN"/>
+        </w:rPr>
+      </w:pPr>
+      <w:r>
+        <w:rPr>
+          <w:noProof/>
+        </w:rPr>
+        <w:lastRenderedPageBreak/>
+        <w:drawing>
+          <wp:inline distT="0" distB="0" distL="0" distR="0" wp14:anchorId="769B43C6" wp14:editId="3D83FA71">
+            <wp:extent cx="4505325" cy="1609725"/>
+            <wp:effectExtent l="0" t="0" r="9525" b="9525"/>
+            <wp:docPr id="385666695" name="Picture 1"/>
+            <wp:cNvGraphicFramePr>
+              <a:graphicFrameLocks xmlns:a="http://schemas.openxmlformats.org/drawingml/2006/main" noChangeAspect="1"/>
+            </wp:cNvGraphicFramePr>
+            <a:graphic xmlns:a="http://schemas.openxmlformats.org/drawingml/2006/main">
+              <a:graphicData uri="http://schemas.openxmlformats.org/drawingml/2006/picture">
+                <pic:pic xmlns:pic="http://schemas.openxmlformats.org/drawingml/2006/picture">
+                  <pic:nvPicPr>
+                    <pic:cNvPr id="385666695" name=""/>
+                    <pic:cNvPicPr/>
+                  </pic:nvPicPr>
+                  <pic:blipFill>
+                    <a:blip r:embed="rId39"/>
+                    <a:stretch>
+                      <a:fillRect/>
+                    </a:stretch>
+                  </pic:blipFill>
+                  <pic:spPr>
+                    <a:xfrm>
+                      <a:off x="0" y="0"/>
+                      <a:ext cx="4505325" cy="1609725"/>
+                    </a:xfrm>
+                    <a:prstGeom prst="rect">
+                      <a:avLst/>
+                    </a:prstGeom>
+                  </pic:spPr>
+                </pic:pic>
+              </a:graphicData>
+            </a:graphic>
+          </wp:inline>
+        </w:drawing>
+      </w:r>
+    </w:p>
+    <w:p>
+      <w:pPr>
+        <w:ind w:left="-1560"/>
+        <w:rPr>
+          <w:sz w:val="32"/>
+          <w:szCs w:val="32"/>
+          <w:vertAlign w:val="superscript"/>
+          <w:lang w:val="en-IN"/>
+        </w:rPr>
+      </w:pPr>
+    </w:p>
+    <w:p>
+      <w:pPr>
+        <w:ind w:left="-1560"/>
+        <w:rPr>
+          <w:sz w:val="32"/>
+          <w:szCs w:val="32"/>
+          <w:vertAlign w:val="superscript"/>
+          <w:lang w:val="en-IN"/>
+        </w:rPr>
+      </w:pPr>
+      <w:r>
+        <w:rPr>
+          <w:sz w:val="32"/>
+          <w:szCs w:val="32"/>
+          <w:vertAlign w:val="superscript"/>
+          <w:lang w:val="en-IN"/>
+        </w:rPr>
+        <w:t xml:space="preserve">4.3 Fraunhofer distance: Calculate the gain, half power beamwidth (HPBW), and Fraunhofer distance for a uniformly illuminated horn antenna at 60 GHz with dimensions of 4.6 cm x 3.5 cm. </w:t>
+      </w:r>
+    </w:p>
+    <w:p>
+      <w:pPr>
+        <w:ind w:left="-1560"/>
+        <w:rPr>
+          <w:sz w:val="32"/>
+          <w:szCs w:val="32"/>
+          <w:vertAlign w:val="superscript"/>
+          <w:lang w:val="en-IN"/>
+        </w:rPr>
+      </w:pPr>
+      <w:r>
+        <w:rPr>
+          <w:sz w:val="32"/>
+          <w:szCs w:val="32"/>
+          <w:vertAlign w:val="superscript"/>
+          <w:lang w:val="en-IN"/>
+        </w:rPr>
+        <w:t xml:space="preserve">Hint: HPBW for the horn antenna can be estimated as HPBW = 51 </w:t>
+      </w:r>
+      <m:oMath>
+        <m:f>
+          <m:fPr>
+            <m:type m:val="skw"/>
+            <m:ctrlPr>
+              <w:rPr>
+                <w:rFonts w:ascii="Cambria Math" w:hAnsi="Cambria Math"/>
+                <w:i/>
+                <w:iCs/>
+                <w:sz w:val="32"/>
+                <w:szCs w:val="32"/>
+                <w:vertAlign w:val="superscript"/>
+                <w:lang w:val="en-IN"/>
+              </w:rPr>
+            </m:ctrlPr>
+          </m:fPr>
+          <m:num>
+            <m:r>
+              <w:rPr>
+                <w:rFonts w:ascii="Cambria Math" w:hAnsi="Cambria Math"/>
+                <w:sz w:val="32"/>
+                <w:szCs w:val="32"/>
+                <w:vertAlign w:val="superscript"/>
+                <w:lang w:val="el-GR"/>
+              </w:rPr>
+              <m:t>λ</m:t>
+            </m:r>
+          </m:num>
+          <m:den>
+            <m:r>
+              <w:rPr>
+                <w:rFonts w:ascii="Cambria Math" w:hAnsi="Cambria Math"/>
+                <w:sz w:val="32"/>
+                <w:szCs w:val="32"/>
+                <w:vertAlign w:val="superscript"/>
+              </w:rPr>
+              <m:t>a</m:t>
+            </m:r>
+          </m:den>
+        </m:f>
+      </m:oMath>
+      <w:r>
+        <w:rPr>
+          <w:sz w:val="32"/>
+          <w:szCs w:val="32"/>
+          <w:vertAlign w:val="superscript"/>
+          <w:lang w:val="en-IN"/>
+        </w:rPr>
+        <w:t>, where a is the aperture width.</w:t>
+      </w:r>
+    </w:p>
+    <w:p>
+      <w:pPr>
+        <w:ind w:left="-1560"/>
+        <w:rPr>
+          <w:sz w:val="32"/>
+          <w:szCs w:val="32"/>
+          <w:vertAlign w:val="superscript"/>
+          <w:lang w:val="en-IN"/>
+        </w:rPr>
+      </w:pPr>
+      <w:r>
+        <w:rPr>
+          <w:noProof/>
+        </w:rPr>
+        <w:drawing>
+          <wp:inline distT="0" distB="0" distL="0" distR="0" wp14:anchorId="6C58883B" wp14:editId="55F4BF23">
+            <wp:extent cx="5486400" cy="2626360"/>
+            <wp:effectExtent l="0" t="0" r="0" b="2540"/>
+            <wp:docPr id="850475845" name="Picture 1"/>
+            <wp:cNvGraphicFramePr>
+              <a:graphicFrameLocks xmlns:a="http://schemas.openxmlformats.org/drawingml/2006/main" noChangeAspect="1"/>
+            </wp:cNvGraphicFramePr>
+            <a:graphic xmlns:a="http://schemas.openxmlformats.org/drawingml/2006/main">
+              <a:graphicData uri="http://schemas.openxmlformats.org/drawingml/2006/picture">
+                <pic:pic xmlns:pic="http://schemas.openxmlformats.org/drawingml/2006/picture">
+                  <pic:nvPicPr>
+                    <pic:cNvPr id="850475845" name=""/>
+                    <pic:cNvPicPr/>
+                  </pic:nvPicPr>
+                  <pic:blipFill>
+                    <a:blip r:embed="rId40"/>
+                    <a:stretch>
+                      <a:fillRect/>
+                    </a:stretch>
+                  </pic:blipFill>
+                  <pic:spPr>
+                    <a:xfrm>
+                      <a:off x="0" y="0"/>
+                      <a:ext cx="5486400" cy="2626360"/>
+                    </a:xfrm>
+                    <a:prstGeom prst="rect">
+                      <a:avLst/>
+                    </a:prstGeom>
+                  </pic:spPr>
+                </pic:pic>
+              </a:graphicData>
+            </a:graphic>
+          </wp:inline>
+        </w:drawing>
+      </w:r>
+    </w:p>
+    <w:p>
+      <w:pPr>
+        <w:ind w:left="-1560"/>
+        <w:rPr>
+          <w:sz w:val="32"/>
+          <w:szCs w:val="32"/>
+          <w:vertAlign w:val="superscript"/>
+          <w:lang w:val="en-IN"/>
+        </w:rPr>
+      </w:pPr>
+      <w:r>
+        <w:rPr>
+          <w:noProof/>
+        </w:rPr>
+        <w:drawing>
+          <wp:inline distT="0" distB="0" distL="0" distR="0" wp14:anchorId="140E9BD2" wp14:editId="7325782F">
+            <wp:extent cx="5486400" cy="3112770"/>
+            <wp:effectExtent l="0" t="0" r="0" b="0"/>
+            <wp:docPr id="295181873" name="Picture 1"/>
+            <wp:cNvGraphicFramePr>
+              <a:graphicFrameLocks xmlns:a="http://schemas.openxmlformats.org/drawingml/2006/main" noChangeAspect="1"/>
+            </wp:cNvGraphicFramePr>
+            <a:graphic xmlns:a="http://schemas.openxmlformats.org/drawingml/2006/main">
+              <a:graphicData uri="http://schemas.openxmlformats.org/drawingml/2006/picture">
+                <pic:pic xmlns:pic="http://schemas.openxmlformats.org/drawingml/2006/picture">
+                  <pic:nvPicPr>
+                    <pic:cNvPr id="295181873" name=""/>
+                    <pic:cNvPicPr/>
+                  </pic:nvPicPr>
+                  <pic:blipFill>
+                    <a:blip r:embed="rId41"/>
+                    <a:stretch>
+                      <a:fillRect/>
+                    </a:stretch>
+                  </pic:blipFill>
+                  <pic:spPr>
+                    <a:xfrm>
+                      <a:off x="0" y="0"/>
+                      <a:ext cx="5486400" cy="3112770"/>
+                    </a:xfrm>
+                    <a:prstGeom prst="rect">
+                      <a:avLst/>
+                    </a:prstGeom>
+                  </pic:spPr>
+                </pic:pic>
+              </a:graphicData>
+            </a:graphic>
+          </wp:inline>
+        </w:drawing>
+      </w:r>
+    </w:p>
+    <w:p>
+      <w:pPr>
+        <w:ind w:left="-1560"/>
+        <w:rPr>
+          <w:sz w:val="32"/>
+          <w:szCs w:val="32"/>
+          <w:vertAlign w:val="superscript"/>
+          <w:lang w:val="en-IN"/>
+        </w:rPr>
+      </w:pPr>
+      <w:r>
+        <w:rPr>
+          <w:noProof/>
+        </w:rPr>
+        <w:lastRenderedPageBreak/>
+        <w:drawing>
+          <wp:inline distT="0" distB="0" distL="0" distR="0" wp14:anchorId="33230D42" wp14:editId="62D23D99">
+            <wp:extent cx="5486400" cy="1402080"/>
+            <wp:effectExtent l="0" t="0" r="0" b="7620"/>
+            <wp:docPr id="1361589494" name="Picture 1"/>
+            <wp:cNvGraphicFramePr>
+              <a:graphicFrameLocks xmlns:a="http://schemas.openxmlformats.org/drawingml/2006/main" noChangeAspect="1"/>
+            </wp:cNvGraphicFramePr>
+            <a:graphic xmlns:a="http://schemas.openxmlformats.org/drawingml/2006/main">
+              <a:graphicData uri="http://schemas.openxmlformats.org/drawingml/2006/picture">
+                <pic:pic xmlns:pic="http://schemas.openxmlformats.org/drawingml/2006/picture">
+                  <pic:nvPicPr>
+                    <pic:cNvPr id="1361589494" name=""/>
+                    <pic:cNvPicPr/>
+                  </pic:nvPicPr>
+                  <pic:blipFill>
+                    <a:blip r:embed="rId42"/>
+                    <a:stretch>
+                      <a:fillRect/>
+                    </a:stretch>
+                  </pic:blipFill>
+                  <pic:spPr>
+                    <a:xfrm>
+                      <a:off x="0" y="0"/>
+                      <a:ext cx="5486400" cy="1402080"/>
+                    </a:xfrm>
+                    <a:prstGeom prst="rect">
+                      <a:avLst/>
+                    </a:prstGeom>
+                  </pic:spPr>
+                </pic:pic>
+              </a:graphicData>
+            </a:graphic>
+          </wp:inline>
+        </w:drawing>
+      </w:r>
+    </w:p>
+    <w:p>
+      <w:pPr>
+        <w:ind w:left="-1560"/>
+        <w:rPr>
+          <w:sz w:val="32"/>
+          <w:szCs w:val="32"/>
+          <w:vertAlign w:val="superscript"/>
+          <w:lang w:val="en-IN"/>
+        </w:rPr>
+      </w:pPr>
+      <w:r>
+        <w:rPr>
+          <w:noProof/>
+        </w:rPr>
+        <w:drawing>
+          <wp:inline distT="0" distB="0" distL="0" distR="0" wp14:anchorId="6A9650BF" wp14:editId="60A18C7B">
+            <wp:extent cx="5486400" cy="2214245"/>
+            <wp:effectExtent l="0" t="0" r="0" b="0"/>
+            <wp:docPr id="1437053387" name="Picture 1"/>
+            <wp:cNvGraphicFramePr>
+              <a:graphicFrameLocks xmlns:a="http://schemas.openxmlformats.org/drawingml/2006/main" noChangeAspect="1"/>
+            </wp:cNvGraphicFramePr>
+            <a:graphic xmlns:a="http://schemas.openxmlformats.org/drawingml/2006/main">
+              <a:graphicData uri="http://schemas.openxmlformats.org/drawingml/2006/picture">
+                <pic:pic xmlns:pic="http://schemas.openxmlformats.org/drawingml/2006/picture">
+                  <pic:nvPicPr>
+                    <pic:cNvPr id="1437053387" name=""/>
+                    <pic:cNvPicPr/>
+                  </pic:nvPicPr>
+                  <pic:blipFill>
+                    <a:blip r:embed="rId43"/>
+                    <a:stretch>
+                      <a:fillRect/>
+                    </a:stretch>
+                  </pic:blipFill>
+                  <pic:spPr>
+                    <a:xfrm>
+                      <a:off x="0" y="0"/>
+                      <a:ext cx="5486400" cy="2214245"/>
+                    </a:xfrm>
+                    <a:prstGeom prst="rect">
+                      <a:avLst/>
+                    </a:prstGeom>
+                  </pic:spPr>
+                </pic:pic>
+              </a:graphicData>
+            </a:graphic>
+          </wp:inline>
+        </w:drawing>
+      </w:r>
+    </w:p>
+    <w:p>
+      <w:pPr>
+        <w:ind w:left="-1560"/>
+        <w:rPr>
+          <w:sz w:val="32"/>
+          <w:szCs w:val="32"/>
+          <w:vertAlign w:val="superscript"/>
+          <w:lang w:val="en-IN"/>
+        </w:rPr>
+      </w:pPr>
+      <w:r>
+        <w:rPr>
+          <w:noProof/>
+        </w:rPr>
+        <w:drawing>
+          <wp:inline distT="0" distB="0" distL="0" distR="0" wp14:anchorId="3279CE15" wp14:editId="05E3D6BF">
+            <wp:extent cx="3305175" cy="1809750"/>
+            <wp:effectExtent l="0" t="0" r="9525" b="0"/>
+            <wp:docPr id="1625720355" name="Picture 1"/>
+            <wp:cNvGraphicFramePr>
+              <a:graphicFrameLocks xmlns:a="http://schemas.openxmlformats.org/drawingml/2006/main" noChangeAspect="1"/>
+            </wp:cNvGraphicFramePr>
+            <a:graphic xmlns:a="http://schemas.openxmlformats.org/drawingml/2006/main">
+              <a:graphicData uri="http://schemas.openxmlformats.org/drawingml/2006/picture">
+                <pic:pic xmlns:pic="http://schemas.openxmlformats.org/drawingml/2006/picture">
+                  <pic:nvPicPr>
+                    <pic:cNvPr id="1625720355" name=""/>
+                    <pic:cNvPicPr/>
+                  </pic:nvPicPr>
+                  <pic:blipFill>
+                    <a:blip r:embed="rId44"/>
+                    <a:stretch>
+                      <a:fillRect/>
+                    </a:stretch>
+                  </pic:blipFill>
+                  <pic:spPr>
+                    <a:xfrm>
+                      <a:off x="0" y="0"/>
+                      <a:ext cx="3305175" cy="1809750"/>
+                    </a:xfrm>
+                    <a:prstGeom prst="rect">
+                      <a:avLst/>
+                    </a:prstGeom>
+                  </pic:spPr>
+                </pic:pic>
+              </a:graphicData>
+            </a:graphic>
+          </wp:inline>
+        </w:drawing>
+      </w:r>
+    </w:p>
+    <w:p>
+      <w:pPr>
+        <w:ind w:left="-1560"/>
+        <w:rPr>
+          <w:sz w:val="32"/>
+          <w:szCs w:val="32"/>
+          <w:vertAlign w:val="superscript"/>
+          <w:lang w:val="en-IN"/>
+        </w:rPr>
+      </w:pPr>
+    </w:p>
+    <w:p>
+      <w:pPr>
+        <w:ind w:left="-1560"/>
+        <w:rPr>
+          <w:sz w:val="32"/>
+          <w:szCs w:val="32"/>
+          <w:vertAlign w:val="superscript"/>
+          <w:lang w:val="en-IN"/>
+        </w:rPr>
+      </w:pPr>
+      <w:r>
+        <w:rPr>
+          <w:sz w:val="32"/>
+          <w:szCs w:val="32"/>
+          <w:vertAlign w:val="superscript"/>
+        </w:rPr>
+        <w:t xml:space="preserve">4.4 Free space propagation: Assume the transmitter power is 1 W at 60 GHz fed into the transmitter antenna. Using the horn antenna from Problem 4.3 at both the transmitter and receiver: </w:t>
+      </w:r>
+    </w:p>
+    <w:p>
+      <w:pPr>
+        <w:numPr>
+          <w:ilvl w:val="0"/>
+          <w:numId w:val="59"/>
+        </w:numPr>
+        <w:rPr>
+          <w:sz w:val="32"/>
+          <w:szCs w:val="32"/>
+          <w:vertAlign w:val="superscript"/>
+          <w:lang w:val="en-IN"/>
+        </w:rPr>
+      </w:pPr>
+      <w:r>
+        <w:rPr>
+          <w:sz w:val="32"/>
+          <w:szCs w:val="32"/>
+          <w:vertAlign w:val="superscript"/>
+        </w:rPr>
+        <w:t xml:space="preserve">Calculate the free space path loss at 1m, 100m, and 1000 m. </w:t>
+      </w:r>
+    </w:p>
+    <w:p>
+      <w:pPr>
+        <w:numPr>
+          <w:ilvl w:val="0"/>
+          <w:numId w:val="59"/>
+        </w:numPr>
+        <w:rPr>
+          <w:sz w:val="32"/>
+          <w:szCs w:val="32"/>
+          <w:vertAlign w:val="superscript"/>
+          <w:lang w:val="en-IN"/>
+        </w:rPr>
+      </w:pPr>
+      <w:r>
+        <w:rPr>
+          <w:sz w:val="32"/>
+          <w:szCs w:val="32"/>
+          <w:vertAlign w:val="superscript"/>
+        </w:rPr>
+        <w:t xml:space="preserve">Calculate the received signal power at these distances. </w:t>
+      </w:r>
+    </w:p>
+    <w:p>
+      <w:pPr>
+        <w:numPr>
+          <w:ilvl w:val="0"/>
+          <w:numId w:val="59"/>
+        </w:numPr>
+        <w:rPr>
+          <w:sz w:val="32"/>
+          <w:szCs w:val="32"/>
+          <w:vertAlign w:val="superscript"/>
+          <w:lang w:val="en-IN"/>
+        </w:rPr>
+      </w:pPr>
+      <w:r>
+        <w:rPr>
+          <w:sz w:val="32"/>
+          <w:szCs w:val="32"/>
+          <w:vertAlign w:val="superscript"/>
+        </w:rPr>
+        <w:t>What is the rms voltage received at the antenna if the receiver antenna has purely real impedance of 50 Ω.Q and is matched to the receiver?</w:t>
+      </w:r>
+    </w:p>
+    <w:p>
+      <w:pPr>
+        <w:ind w:left="-1560"/>
+        <w:rPr>
+          <w:sz w:val="32"/>
+          <w:szCs w:val="32"/>
+          <w:vertAlign w:val="superscript"/>
+          <w:lang w:val="en-IN"/>
+        </w:rPr>
+      </w:pPr>
+      <w:r>
+        <w:rPr>
+          <w:noProof/>
+        </w:rPr>
+        <w:lastRenderedPageBreak/>
+        <w:drawing>
+          <wp:inline distT="0" distB="0" distL="0" distR="0" wp14:anchorId="1E197262" wp14:editId="5145ED25">
+            <wp:extent cx="5438775" cy="2914650"/>
+            <wp:effectExtent l="0" t="0" r="9525" b="0"/>
+            <wp:docPr id="650980903" name="Picture 1"/>
+            <wp:cNvGraphicFramePr>
+              <a:graphicFrameLocks xmlns:a="http://schemas.openxmlformats.org/drawingml/2006/main" noChangeAspect="1"/>
+            </wp:cNvGraphicFramePr>
+            <a:graphic xmlns:a="http://schemas.openxmlformats.org/drawingml/2006/main">
+              <a:graphicData uri="http://schemas.openxmlformats.org/drawingml/2006/picture">
+                <pic:pic xmlns:pic="http://schemas.openxmlformats.org/drawingml/2006/picture">
+                  <pic:nvPicPr>
+                    <pic:cNvPr id="650980903" name=""/>
+                    <pic:cNvPicPr/>
+                  </pic:nvPicPr>
+                  <pic:blipFill>
+                    <a:blip r:embed="rId45"/>
+                    <a:stretch>
+                      <a:fillRect/>
+                    </a:stretch>
+                  </pic:blipFill>
+                  <pic:spPr>
+                    <a:xfrm>
+                      <a:off x="0" y="0"/>
+                      <a:ext cx="5438775" cy="2914650"/>
+                    </a:xfrm>
+                    <a:prstGeom prst="rect">
+                      <a:avLst/>
+                    </a:prstGeom>
+                  </pic:spPr>
+                </pic:pic>
+              </a:graphicData>
+            </a:graphic>
+          </wp:inline>
+        </w:drawing>
+      </w:r>
+    </w:p>
+    <w:p>
+      <w:pPr>
+        <w:ind w:left="-1560"/>
+        <w:rPr>
+          <w:sz w:val="32"/>
+          <w:szCs w:val="32"/>
+          <w:vertAlign w:val="superscript"/>
+          <w:lang w:val="en-IN"/>
+        </w:rPr>
+      </w:pPr>
+    </w:p>
+    <w:p>
+      <w:pPr>
+        <w:ind w:left="-1560"/>
+        <w:rPr>
+          <w:sz w:val="32"/>
+          <w:szCs w:val="32"/>
+          <w:vertAlign w:val="superscript"/>
+          <w:lang w:val="en-IN"/>
+        </w:rPr>
+      </w:pPr>
+      <w:r>
+        <w:rPr>
+          <w:noProof/>
+        </w:rPr>
+        <w:drawing>
+          <wp:inline distT="0" distB="0" distL="0" distR="0" wp14:anchorId="725FE5D2" wp14:editId="399B1B04">
+            <wp:extent cx="5486400" cy="3372485"/>
+            <wp:effectExtent l="0" t="0" r="0" b="0"/>
+            <wp:docPr id="956960370" name="Picture 1"/>
+            <wp:cNvGraphicFramePr>
+              <a:graphicFrameLocks xmlns:a="http://schemas.openxmlformats.org/drawingml/2006/main" noChangeAspect="1"/>
+            </wp:cNvGraphicFramePr>
+            <a:graphic xmlns:a="http://schemas.openxmlformats.org/drawingml/2006/main">
+              <a:graphicData uri="http://schemas.openxmlformats.org/drawingml/2006/picture">
+                <pic:pic xmlns:pic="http://schemas.openxmlformats.org/drawingml/2006/picture">
+                  <pic:nvPicPr>
+                    <pic:cNvPr id="956960370" name=""/>
+                    <pic:cNvPicPr/>
+                  </pic:nvPicPr>
+                  <pic:blipFill>
+                    <a:blip r:embed="rId46"/>
+                    <a:stretch>
+                      <a:fillRect/>
+                    </a:stretch>
+                  </pic:blipFill>
+                  <pic:spPr>
+                    <a:xfrm>
+                      <a:off x="0" y="0"/>
+                      <a:ext cx="5486400" cy="3372485"/>
+                    </a:xfrm>
+                    <a:prstGeom prst="rect">
+                      <a:avLst/>
+                    </a:prstGeom>
+                  </pic:spPr>
+                </pic:pic>
+              </a:graphicData>
+            </a:graphic>
+          </wp:inline>
+        </w:drawing>
+      </w:r>
+    </w:p>
+    <w:p>
+      <w:pPr>
+        <w:ind w:left="-1560"/>
+        <w:rPr>
+          <w:sz w:val="32"/>
+          <w:szCs w:val="32"/>
+          <w:vertAlign w:val="superscript"/>
+          <w:lang w:val="en-IN"/>
+        </w:rPr>
+      </w:pPr>
+    </w:p>
+    <w:p>
+      <w:pPr>
+        <w:ind w:left="-1560"/>
+        <w:rPr>
+          <w:sz w:val="32"/>
+          <w:szCs w:val="32"/>
+          <w:vertAlign w:val="superscript"/>
+          <w:lang w:val="en-IN"/>
+        </w:rPr>
+      </w:pPr>
+      <w:r>
+        <w:rPr>
+          <w:noProof/>
+        </w:rPr>
+        <w:lastRenderedPageBreak/>
+        <w:drawing>
+          <wp:inline distT="0" distB="0" distL="0" distR="0" wp14:anchorId="19774EB9" wp14:editId="1BDF6405">
+            <wp:extent cx="5486400" cy="3140710"/>
+            <wp:effectExtent l="0" t="0" r="0" b="2540"/>
+            <wp:docPr id="2000752004" name="Picture 1"/>
+            <wp:cNvGraphicFramePr>
+              <a:graphicFrameLocks xmlns:a="http://schemas.openxmlformats.org/drawingml/2006/main" noChangeAspect="1"/>
+            </wp:cNvGraphicFramePr>
+            <a:graphic xmlns:a="http://schemas.openxmlformats.org/drawingml/2006/main">
+              <a:graphicData uri="http://schemas.openxmlformats.org/drawingml/2006/picture">
+                <pic:pic xmlns:pic="http://schemas.openxmlformats.org/drawingml/2006/picture">
+                  <pic:nvPicPr>
+                    <pic:cNvPr id="2000752004" name=""/>
+                    <pic:cNvPicPr/>
+                  </pic:nvPicPr>
+                  <pic:blipFill>
+                    <a:blip r:embed="rId47"/>
+                    <a:stretch>
+                      <a:fillRect/>
+                    </a:stretch>
+                  </pic:blipFill>
+                  <pic:spPr>
+                    <a:xfrm>
+                      <a:off x="0" y="0"/>
+                      <a:ext cx="5486400" cy="3140710"/>
+                    </a:xfrm>
+                    <a:prstGeom prst="rect">
+                      <a:avLst/>
+                    </a:prstGeom>
+                  </pic:spPr>
+                </pic:pic>
+              </a:graphicData>
+            </a:graphic>
+          </wp:inline>
+        </w:drawing>
+      </w:r>
+    </w:p>
+    <w:p>
+      <w:pPr>
+        <w:ind w:left="-1560"/>
+        <w:rPr>
+          <w:sz w:val="32"/>
+          <w:szCs w:val="32"/>
+          <w:vertAlign w:val="superscript"/>
+          <w:lang w:val="en-IN"/>
+        </w:rPr>
+      </w:pPr>
+    </w:p>
+    <w:p>
+      <w:pPr>
+        <w:ind w:left="-1560"/>
+        <w:rPr>
+          <w:sz w:val="32"/>
+          <w:szCs w:val="32"/>
+          <w:vertAlign w:val="superscript"/>
+          <w:lang w:val="en-IN"/>
+        </w:rPr>
+      </w:pPr>
+      <w:r>
+        <w:rPr>
+          <w:noProof/>
+        </w:rPr>
+        <w:drawing>
+          <wp:inline distT="0" distB="0" distL="0" distR="0" wp14:anchorId="2DF0AA80" wp14:editId="60B8754F">
+            <wp:extent cx="5486400" cy="2522855"/>
+            <wp:effectExtent l="0" t="0" r="0" b="0"/>
+            <wp:docPr id="1844419986" name="Picture 1"/>
+            <wp:cNvGraphicFramePr>
+              <a:graphicFrameLocks xmlns:a="http://schemas.openxmlformats.org/drawingml/2006/main" noChangeAspect="1"/>
+            </wp:cNvGraphicFramePr>
+            <a:graphic xmlns:a="http://schemas.openxmlformats.org/drawingml/2006/main">
+              <a:graphicData uri="http://schemas.openxmlformats.org/drawingml/2006/picture">
+                <pic:pic xmlns:pic="http://schemas.openxmlformats.org/drawingml/2006/picture">
+                  <pic:nvPicPr>
+                    <pic:cNvPr id="1844419986" name=""/>
+                    <pic:cNvPicPr/>
+                  </pic:nvPicPr>
+                  <pic:blipFill>
+                    <a:blip r:embed="rId48"/>
+                    <a:stretch>
+                      <a:fillRect/>
+                    </a:stretch>
+                  </pic:blipFill>
+                  <pic:spPr>
+                    <a:xfrm>
+                      <a:off x="0" y="0"/>
+                      <a:ext cx="5486400" cy="2522855"/>
+                    </a:xfrm>
+                    <a:prstGeom prst="rect">
+                      <a:avLst/>
+                    </a:prstGeom>
+                  </pic:spPr>
+                </pic:pic>
+              </a:graphicData>
+            </a:graphic>
+          </wp:inline>
+        </w:drawing>
+      </w:r>
+    </w:p>
+    <w:p>
+      <w:pPr>
+        <w:ind w:left="-1560"/>
+        <w:rPr>
+          <w:sz w:val="32"/>
+          <w:szCs w:val="32"/>
+          <w:vertAlign w:val="superscript"/>
+          <w:lang w:val="en-IN"/>
+        </w:rPr>
+      </w:pPr>
+    </w:p>
+    <w:p>
+      <w:pPr>
+        <w:ind w:left="-1560"/>
+        <w:rPr>
+          <w:sz w:val="32"/>
+          <w:szCs w:val="32"/>
+          <w:vertAlign w:val="superscript"/>
+          <w:lang w:val="en-IN"/>
+        </w:rPr>
+      </w:pPr>
+      <w:r>
+        <w:rPr>
+          <w:noProof/>
+        </w:rPr>
+        <w:drawing>
+          <wp:inline distT="0" distB="0" distL="0" distR="0" wp14:anchorId="0981EC07" wp14:editId="02A16262">
+            <wp:extent cx="5486400" cy="1904365"/>
+            <wp:effectExtent l="0" t="0" r="0" b="635"/>
+            <wp:docPr id="342826966" name="Picture 1"/>
+            <wp:cNvGraphicFramePr>
+              <a:graphicFrameLocks xmlns:a="http://schemas.openxmlformats.org/drawingml/2006/main" noChangeAspect="1"/>
+            </wp:cNvGraphicFramePr>
+            <a:graphic xmlns:a="http://schemas.openxmlformats.org/drawingml/2006/main">
+              <a:graphicData uri="http://schemas.openxmlformats.org/drawingml/2006/picture">
+                <pic:pic xmlns:pic="http://schemas.openxmlformats.org/drawingml/2006/picture">
+                  <pic:nvPicPr>
+                    <pic:cNvPr id="342826966" name=""/>
+                    <pic:cNvPicPr/>
+                  </pic:nvPicPr>
+                  <pic:blipFill>
+                    <a:blip r:embed="rId49"/>
+                    <a:stretch>
+                      <a:fillRect/>
+                    </a:stretch>
+                  </pic:blipFill>
+                  <pic:spPr>
+                    <a:xfrm>
+                      <a:off x="0" y="0"/>
+                      <a:ext cx="5486400" cy="1904365"/>
+                    </a:xfrm>
+                    <a:prstGeom prst="rect">
+                      <a:avLst/>
+                    </a:prstGeom>
+                  </pic:spPr>
+                </pic:pic>
+              </a:graphicData>
+            </a:graphic>
+          </wp:inline>
+        </w:drawing>
+      </w:r>
+    </w:p>
+    <w:p>
+      <w:pPr>
+        <w:ind w:left="-1560"/>
+        <w:rPr>
+          <w:sz w:val="32"/>
+          <w:szCs w:val="32"/>
+          <w:vertAlign w:val="superscript"/>
+          <w:lang w:val="en-IN"/>
+        </w:rPr>
+      </w:pPr>
+    </w:p>
+    <w:p>
+      <w:pPr>
+        <w:ind w:left="-1560"/>
+        <w:rPr>
+          <w:sz w:val="32"/>
+          <w:szCs w:val="32"/>
+          <w:vertAlign w:val="superscript"/>
+          <w:lang w:val="en-IN"/>
+        </w:rPr>
+      </w:pPr>
+    </w:p>
+    <w:p>
+      <w:pPr>
+        <w:ind w:left="-1560"/>
+        <w:rPr>
+          <w:sz w:val="32"/>
+          <w:szCs w:val="32"/>
+          <w:vertAlign w:val="superscript"/>
+          <w:lang w:val="en-IN"/>
+        </w:rPr>
+      </w:pPr>
+      <w:r>
+        <w:rPr>
+          <w:sz w:val="32"/>
+          <w:szCs w:val="32"/>
+          <w:vertAlign w:val="superscript"/>
+        </w:rPr>
+        <w:lastRenderedPageBreak/>
+        <w:t xml:space="preserve">4.5 Reflection coefficients: Find the reflection coefficients for typical ground, brick, limestone, glass, and water from data given in Table 4.1 at an incident angle of 30•. Assume lossless dielectrics. Present your final answers in a table. </w:t>
+      </w:r>
+    </w:p>
+    <w:p>
+      <w:pPr>
+        <w:ind w:left="-1560"/>
+        <w:rPr>
+          <w:sz w:val="32"/>
+          <w:szCs w:val="32"/>
+          <w:vertAlign w:val="superscript"/>
+          <w:lang w:val="en-IN"/>
+        </w:rPr>
+      </w:pPr>
+      <w:r>
+        <w:rPr>
+          <w:sz w:val="32"/>
+          <w:szCs w:val="32"/>
+          <w:vertAlign w:val="superscript"/>
+        </w:rPr>
+        <w:drawing>
+          <wp:inline distT="0" distB="0" distL="0" distR="0" wp14:anchorId="566598FD" wp14:editId="7291F8A3">
+            <wp:extent cx="5486400" cy="3878580"/>
+            <wp:effectExtent l="0" t="0" r="0" b="7620"/>
+            <wp:docPr id="9" name="Picture 8">
+              <a:extLst xmlns:a="http://schemas.openxmlformats.org/drawingml/2006/main">
+                <a:ext uri="{FF2B5EF4-FFF2-40B4-BE49-F238E27FC236}">
+                  <a16:creationId xmlns:a16="http://schemas.microsoft.com/office/drawing/2014/main" id="{E61778D7-3DE4-35E8-494B-D2C7F0EBE549}"/>
+                </a:ext>
+              </a:extLst>
+            </wp:docPr>
+            <wp:cNvGraphicFramePr>
+              <a:graphicFrameLocks xmlns:a="http://schemas.openxmlformats.org/drawingml/2006/main" noChangeAspect="1"/>
+            </wp:cNvGraphicFramePr>
+            <a:graphic xmlns:a="http://schemas.openxmlformats.org/drawingml/2006/main">
+              <a:graphicData uri="http://schemas.openxmlformats.org/drawingml/2006/picture">
+                <pic:pic xmlns:pic="http://schemas.openxmlformats.org/drawingml/2006/picture">
+                  <pic:nvPicPr>
+                    <pic:cNvPr id="9" name="Picture 8">
+                      <a:extLst>
+                        <a:ext uri="{FF2B5EF4-FFF2-40B4-BE49-F238E27FC236}">
+                          <a16:creationId xmlns:a16="http://schemas.microsoft.com/office/drawing/2014/main" id="{E61778D7-3DE4-35E8-494B-D2C7F0EBE549}"/>
+                        </a:ext>
+                      </a:extLst>
+                    </pic:cNvPr>
+                    <pic:cNvPicPr>
+                      <a:picLocks noChangeAspect="1"/>
+                    </pic:cNvPicPr>
+                  </pic:nvPicPr>
+                  <pic:blipFill>
+                    <a:blip r:embed="rId50"/>
+                    <a:stretch>
+                      <a:fillRect/>
+                    </a:stretch>
+                  </pic:blipFill>
+                  <pic:spPr>
+                    <a:xfrm>
+                      <a:off x="0" y="0"/>
+                      <a:ext cx="5486400" cy="3878580"/>
+                    </a:xfrm>
+                    <a:prstGeom prst="rect">
+                      <a:avLst/>
+                    </a:prstGeom>
+                  </pic:spPr>
+                </pic:pic>
+              </a:graphicData>
+            </a:graphic>
+          </wp:inline>
+        </w:drawing>
+      </w:r>
+    </w:p>
+    <w:p>
+      <w:pPr>
+        <w:ind w:left="-1560"/>
+        <w:rPr>
+          <w:sz w:val="32"/>
+          <w:szCs w:val="32"/>
+          <w:vertAlign w:val="superscript"/>
+          <w:lang w:val="en-IN"/>
+        </w:rPr>
+      </w:pPr>
+    </w:p>
+    <w:p>
+      <w:pPr>
+        <w:ind w:left="-1560"/>
+        <w:rPr>
+          <w:sz w:val="32"/>
+          <w:szCs w:val="32"/>
+          <w:vertAlign w:val="superscript"/>
+          <w:lang w:val="en-IN"/>
+        </w:rPr>
+      </w:pPr>
+      <w:r>
+        <w:rPr>
+          <w:noProof/>
+        </w:rPr>
+        <w:drawing>
+          <wp:inline distT="0" distB="0" distL="0" distR="0" wp14:anchorId="46B55069" wp14:editId="3A983E81">
+            <wp:extent cx="5486400" cy="2294255"/>
+            <wp:effectExtent l="0" t="0" r="0" b="0"/>
+            <wp:docPr id="2129861734" name="Picture 1"/>
+            <wp:cNvGraphicFramePr>
+              <a:graphicFrameLocks xmlns:a="http://schemas.openxmlformats.org/drawingml/2006/main" noChangeAspect="1"/>
+            </wp:cNvGraphicFramePr>
+            <a:graphic xmlns:a="http://schemas.openxmlformats.org/drawingml/2006/main">
+              <a:graphicData uri="http://schemas.openxmlformats.org/drawingml/2006/picture">
+                <pic:pic xmlns:pic="http://schemas.openxmlformats.org/drawingml/2006/picture">
+                  <pic:nvPicPr>
+                    <pic:cNvPr id="2129861734" name=""/>
+                    <pic:cNvPicPr/>
+                  </pic:nvPicPr>
+                  <pic:blipFill>
+                    <a:blip r:embed="rId51"/>
+                    <a:stretch>
+                      <a:fillRect/>
+                    </a:stretch>
+                  </pic:blipFill>
+                  <pic:spPr>
+                    <a:xfrm>
+                      <a:off x="0" y="0"/>
+                      <a:ext cx="5486400" cy="2294255"/>
+                    </a:xfrm>
+                    <a:prstGeom prst="rect">
+                      <a:avLst/>
+                    </a:prstGeom>
+                  </pic:spPr>
+                </pic:pic>
+              </a:graphicData>
+            </a:graphic>
+          </wp:inline>
+        </w:drawing>
+      </w:r>
+    </w:p>
+    <w:p>
+      <w:pPr>
+        <w:ind w:left="-1560"/>
+        <w:rPr>
+          <w:sz w:val="32"/>
+          <w:szCs w:val="32"/>
+          <w:vertAlign w:val="superscript"/>
+          <w:lang w:val="en-IN"/>
+        </w:rPr>
+      </w:pPr>
+      <w:r>
+        <w:rPr>
+          <w:noProof/>
+        </w:rPr>
+        <w:lastRenderedPageBreak/>
+        <w:drawing>
+          <wp:inline distT="0" distB="0" distL="0" distR="0" wp14:anchorId="13C4CADD" wp14:editId="01161ADF">
+            <wp:extent cx="5486400" cy="2809240"/>
+            <wp:effectExtent l="0" t="0" r="0" b="0"/>
+            <wp:docPr id="1756456463" name="Picture 1"/>
+            <wp:cNvGraphicFramePr>
+              <a:graphicFrameLocks xmlns:a="http://schemas.openxmlformats.org/drawingml/2006/main" noChangeAspect="1"/>
+            </wp:cNvGraphicFramePr>
+            <a:graphic xmlns:a="http://schemas.openxmlformats.org/drawingml/2006/main">
+              <a:graphicData uri="http://schemas.openxmlformats.org/drawingml/2006/picture">
+                <pic:pic xmlns:pic="http://schemas.openxmlformats.org/drawingml/2006/picture">
+                  <pic:nvPicPr>
+                    <pic:cNvPr id="1756456463" name=""/>
+                    <pic:cNvPicPr/>
+                  </pic:nvPicPr>
+                  <pic:blipFill>
+                    <a:blip r:embed="rId52"/>
+                    <a:stretch>
+                      <a:fillRect/>
+                    </a:stretch>
+                  </pic:blipFill>
+                  <pic:spPr>
+                    <a:xfrm>
+                      <a:off x="0" y="0"/>
+                      <a:ext cx="5486400" cy="2809240"/>
+                    </a:xfrm>
+                    <a:prstGeom prst="rect">
+                      <a:avLst/>
+                    </a:prstGeom>
+                  </pic:spPr>
+                </pic:pic>
+              </a:graphicData>
+            </a:graphic>
+          </wp:inline>
+        </w:drawing>
+      </w:r>
+    </w:p>
+    <w:p>
+      <w:pPr>
+        <w:ind w:left="-1560"/>
+        <w:rPr>
+          <w:sz w:val="32"/>
+          <w:szCs w:val="32"/>
+          <w:vertAlign w:val="superscript"/>
+          <w:lang w:val="en-IN"/>
+        </w:rPr>
+      </w:pPr>
+      <w:r>
+        <w:rPr>
+          <w:noProof/>
+        </w:rPr>
+        <w:drawing>
+          <wp:inline distT="0" distB="0" distL="0" distR="0" wp14:anchorId="533AAC29" wp14:editId="00C7A0DD">
+            <wp:extent cx="5486400" cy="2357120"/>
+            <wp:effectExtent l="0" t="0" r="0" b="5080"/>
+            <wp:docPr id="470778686" name="Picture 1"/>
+            <wp:cNvGraphicFramePr>
+              <a:graphicFrameLocks xmlns:a="http://schemas.openxmlformats.org/drawingml/2006/main" noChangeAspect="1"/>
+            </wp:cNvGraphicFramePr>
+            <a:graphic xmlns:a="http://schemas.openxmlformats.org/drawingml/2006/main">
+              <a:graphicData uri="http://schemas.openxmlformats.org/drawingml/2006/picture">
+                <pic:pic xmlns:pic="http://schemas.openxmlformats.org/drawingml/2006/picture">
+                  <pic:nvPicPr>
+                    <pic:cNvPr id="470778686" name=""/>
+                    <pic:cNvPicPr/>
+                  </pic:nvPicPr>
+                  <pic:blipFill>
+                    <a:blip r:embed="rId53"/>
+                    <a:stretch>
+                      <a:fillRect/>
+                    </a:stretch>
+                  </pic:blipFill>
+                  <pic:spPr>
+                    <a:xfrm>
+                      <a:off x="0" y="0"/>
+                      <a:ext cx="5486400" cy="2357120"/>
+                    </a:xfrm>
+                    <a:prstGeom prst="rect">
+                      <a:avLst/>
+                    </a:prstGeom>
+                  </pic:spPr>
+                </pic:pic>
+              </a:graphicData>
+            </a:graphic>
+          </wp:inline>
+        </w:drawing>
+      </w:r>
+    </w:p>
+    <w:p>
+      <w:pPr>
+        <w:ind w:left="-1560"/>
+        <w:rPr>
+          <w:sz w:val="32"/>
+          <w:szCs w:val="32"/>
+          <w:vertAlign w:val="superscript"/>
+          <w:lang w:val="en-IN"/>
+        </w:rPr>
+      </w:pPr>
+    </w:p>
+    <w:p>
+      <w:pPr>
+        <w:ind w:left="-1560"/>
+        <w:rPr>
+          <w:sz w:val="32"/>
+          <w:szCs w:val="32"/>
+          <w:vertAlign w:val="superscript"/>
+          <w:lang w:val="en-IN"/>
+        </w:rPr>
+      </w:pPr>
+      <w:r>
+        <w:rPr>
+          <w:sz w:val="32"/>
+          <w:szCs w:val="32"/>
+          <w:vertAlign w:val="superscript"/>
+        </w:rPr>
+        <w:t xml:space="preserve">4.6 Surface roughness: Explain the dependence of surface roughness on the frequency and angle of incidence. </w:t>
+      </w:r>
+    </w:p>
+    <w:p>
+      <w:pPr>
+        <w:ind w:left="-1560"/>
+        <w:rPr>
+          <w:sz w:val="32"/>
+          <w:szCs w:val="32"/>
+          <w:vertAlign w:val="superscript"/>
+          <w:lang w:val="en-IN"/>
+        </w:rPr>
+      </w:pPr>
+    </w:p>
+    <w:p>
+      <w:pPr>
+        <w:ind w:left="-1560"/>
+        <w:rPr>
+          <w:sz w:val="32"/>
+          <w:szCs w:val="32"/>
+          <w:vertAlign w:val="superscript"/>
+          <w:lang w:val="en-IN"/>
+        </w:rPr>
+      </w:pPr>
+      <w:r>
+        <w:rPr>
+          <w:noProof/>
+        </w:rPr>
+        <w:drawing>
+          <wp:inline distT="0" distB="0" distL="0" distR="0" wp14:anchorId="32438745" wp14:editId="32BC5ADD">
+            <wp:extent cx="5486400" cy="1077595"/>
+            <wp:effectExtent l="0" t="0" r="0" b="8255"/>
+            <wp:docPr id="249866849" name="Picture 1"/>
+            <wp:cNvGraphicFramePr>
+              <a:graphicFrameLocks xmlns:a="http://schemas.openxmlformats.org/drawingml/2006/main" noChangeAspect="1"/>
+            </wp:cNvGraphicFramePr>
+            <a:graphic xmlns:a="http://schemas.openxmlformats.org/drawingml/2006/main">
+              <a:graphicData uri="http://schemas.openxmlformats.org/drawingml/2006/picture">
+                <pic:pic xmlns:pic="http://schemas.openxmlformats.org/drawingml/2006/picture">
+                  <pic:nvPicPr>
+                    <pic:cNvPr id="249866849" name=""/>
+                    <pic:cNvPicPr/>
+                  </pic:nvPicPr>
+                  <pic:blipFill>
+                    <a:blip r:embed="rId54"/>
+                    <a:stretch>
+                      <a:fillRect/>
+                    </a:stretch>
+                  </pic:blipFill>
+                  <pic:spPr>
+                    <a:xfrm>
+                      <a:off x="0" y="0"/>
+                      <a:ext cx="5486400" cy="1077595"/>
+                    </a:xfrm>
+                    <a:prstGeom prst="rect">
+                      <a:avLst/>
+                    </a:prstGeom>
+                  </pic:spPr>
+                </pic:pic>
+              </a:graphicData>
+            </a:graphic>
+          </wp:inline>
+        </w:drawing>
+      </w:r>
+    </w:p>
+    <w:p>
+      <w:pPr>
+        <w:ind w:left="-1560"/>
+        <w:rPr>
+          <w:sz w:val="32"/>
+          <w:szCs w:val="32"/>
+          <w:vertAlign w:val="superscript"/>
+          <w:lang w:val="en-IN"/>
+        </w:rPr>
+      </w:pPr>
+      <w:r>
+        <w:rPr>
+          <w:noProof/>
+        </w:rPr>
+        <w:lastRenderedPageBreak/>
+        <w:drawing>
+          <wp:inline distT="0" distB="0" distL="0" distR="0" wp14:anchorId="1AED7F9C" wp14:editId="4456091B">
+            <wp:extent cx="5486400" cy="3825875"/>
+            <wp:effectExtent l="0" t="0" r="0" b="3175"/>
+            <wp:docPr id="667614920" name="Picture 1"/>
+            <wp:cNvGraphicFramePr>
+              <a:graphicFrameLocks xmlns:a="http://schemas.openxmlformats.org/drawingml/2006/main" noChangeAspect="1"/>
+            </wp:cNvGraphicFramePr>
+            <a:graphic xmlns:a="http://schemas.openxmlformats.org/drawingml/2006/main">
+              <a:graphicData uri="http://schemas.openxmlformats.org/drawingml/2006/picture">
+                <pic:pic xmlns:pic="http://schemas.openxmlformats.org/drawingml/2006/picture">
+                  <pic:nvPicPr>
+                    <pic:cNvPr id="667614920" name=""/>
+                    <pic:cNvPicPr/>
+                  </pic:nvPicPr>
+                  <pic:blipFill>
+                    <a:blip r:embed="rId55"/>
+                    <a:stretch>
+                      <a:fillRect/>
+                    </a:stretch>
+                  </pic:blipFill>
+                  <pic:spPr>
+                    <a:xfrm>
+                      <a:off x="0" y="0"/>
+                      <a:ext cx="5486400" cy="3825875"/>
+                    </a:xfrm>
+                    <a:prstGeom prst="rect">
+                      <a:avLst/>
+                    </a:prstGeom>
+                  </pic:spPr>
+                </pic:pic>
+              </a:graphicData>
+            </a:graphic>
+          </wp:inline>
+        </w:drawing>
+      </w:r>
+    </w:p>
+    <w:p>
+      <w:pPr>
+        <w:ind w:left="-1560"/>
+        <w:rPr>
+          <w:sz w:val="32"/>
+          <w:szCs w:val="32"/>
+          <w:vertAlign w:val="superscript"/>
+          <w:lang w:val="en-IN"/>
+        </w:rPr>
+      </w:pPr>
+      <w:r>
+        <w:rPr>
+          <w:noProof/>
+        </w:rPr>
+        <w:drawing>
+          <wp:inline distT="0" distB="0" distL="0" distR="0" wp14:anchorId="4F1AC825" wp14:editId="35334BA8">
+            <wp:extent cx="5486400" cy="2051685"/>
+            <wp:effectExtent l="0" t="0" r="0" b="5715"/>
+            <wp:docPr id="190741977" name="Picture 1"/>
+            <wp:cNvGraphicFramePr>
+              <a:graphicFrameLocks xmlns:a="http://schemas.openxmlformats.org/drawingml/2006/main" noChangeAspect="1"/>
+            </wp:cNvGraphicFramePr>
+            <a:graphic xmlns:a="http://schemas.openxmlformats.org/drawingml/2006/main">
+              <a:graphicData uri="http://schemas.openxmlformats.org/drawingml/2006/picture">
+                <pic:pic xmlns:pic="http://schemas.openxmlformats.org/drawingml/2006/picture">
+                  <pic:nvPicPr>
+                    <pic:cNvPr id="190741977" name=""/>
+                    <pic:cNvPicPr/>
+                  </pic:nvPicPr>
+                  <pic:blipFill>
+                    <a:blip r:embed="rId56"/>
+                    <a:stretch>
+                      <a:fillRect/>
+                    </a:stretch>
+                  </pic:blipFill>
+                  <pic:spPr>
+                    <a:xfrm>
+                      <a:off x="0" y="0"/>
+                      <a:ext cx="5486400" cy="2051685"/>
+                    </a:xfrm>
+                    <a:prstGeom prst="rect">
+                      <a:avLst/>
+                    </a:prstGeom>
+                  </pic:spPr>
+                </pic:pic>
+              </a:graphicData>
+            </a:graphic>
+          </wp:inline>
+        </w:drawing>
+      </w:r>
+    </w:p>
+    <w:p>
+      <w:pPr>
+        <w:ind w:left="-1560"/>
+        <w:rPr>
+          <w:sz w:val="32"/>
+          <w:szCs w:val="32"/>
+          <w:vertAlign w:val="superscript"/>
+          <w:lang w:val="en-IN"/>
+        </w:rPr>
+      </w:pPr>
+      <w:r>
+        <w:rPr>
+          <w:noProof/>
+        </w:rPr>
+        <w:drawing>
+          <wp:inline distT="0" distB="0" distL="0" distR="0" wp14:anchorId="22C481A9" wp14:editId="09271F45">
+            <wp:extent cx="5486400" cy="2023110"/>
+            <wp:effectExtent l="0" t="0" r="0" b="0"/>
+            <wp:docPr id="1419762672" name="Picture 1"/>
+            <wp:cNvGraphicFramePr>
+              <a:graphicFrameLocks xmlns:a="http://schemas.openxmlformats.org/drawingml/2006/main" noChangeAspect="1"/>
+            </wp:cNvGraphicFramePr>
+            <a:graphic xmlns:a="http://schemas.openxmlformats.org/drawingml/2006/main">
+              <a:graphicData uri="http://schemas.openxmlformats.org/drawingml/2006/picture">
+                <pic:pic xmlns:pic="http://schemas.openxmlformats.org/drawingml/2006/picture">
+                  <pic:nvPicPr>
+                    <pic:cNvPr id="1419762672" name=""/>
+                    <pic:cNvPicPr/>
+                  </pic:nvPicPr>
+                  <pic:blipFill>
+                    <a:blip r:embed="rId57"/>
+                    <a:stretch>
+                      <a:fillRect/>
+                    </a:stretch>
+                  </pic:blipFill>
+                  <pic:spPr>
+                    <a:xfrm>
+                      <a:off x="0" y="0"/>
+                      <a:ext cx="5486400" cy="2023110"/>
+                    </a:xfrm>
+                    <a:prstGeom prst="rect">
+                      <a:avLst/>
+                    </a:prstGeom>
+                  </pic:spPr>
+                </pic:pic>
+              </a:graphicData>
+            </a:graphic>
+          </wp:inline>
+        </w:drawing>
+      </w:r>
+    </w:p>
+    <w:p>
+      <w:pPr>
         <w:rPr>
           <w:sz w:val="24"/>
           <w:szCs w:val="24"/>
@@ -24526,6 +26766,119 @@
     </w:lvl>
   </w:abstractNum>
   <w:abstractNum w:abstractNumId="24" w15:restartNumberingAfterBreak="0">
+    <w:nsid w:val="2FC56595"/>
+    <w:multiLevelType w:val="hybridMultilevel"/>
+    <w:tmpl w:val="9E5E1EF4"/>
+    <w:lvl w:ilvl="0" w:tplc="D4508B76">
+      <w:start w:val="1"/>
+      <w:numFmt w:val="lowerLetter"/>
+      <w:lvlText w:val="(%1)"/>
+      <w:lvlJc w:val="left"/>
+      <w:pPr>
+        <w:tabs>
+          <w:tab w:val="num" w:pos="720"/>
+        </w:tabs>
+        <w:ind w:left="720" w:hanging="360"/>
+      </w:pPr>
+    </w:lvl>
+    <w:lvl w:ilvl="1" w:tplc="8E2EEE16" w:tentative="1">
+      <w:start w:val="1"/>
+      <w:numFmt w:val="lowerLetter"/>
+      <w:lvlText w:val="(%2)"/>
+      <w:lvlJc w:val="left"/>
+      <w:pPr>
+        <w:tabs>
+          <w:tab w:val="num" w:pos="1440"/>
+        </w:tabs>
+        <w:ind w:left="1440" w:hanging="360"/>
+      </w:pPr>
+    </w:lvl>
+    <w:lvl w:ilvl="2" w:tplc="65EEBAA8" w:tentative="1">
+      <w:start w:val="1"/>
+      <w:numFmt w:val="lowerLetter"/>
+      <w:lvlText w:val="(%3)"/>
+      <w:lvlJc w:val="left"/>
+      <w:pPr>
+        <w:tabs>
+          <w:tab w:val="num" w:pos="2160"/>
+        </w:tabs>
+        <w:ind w:left="2160" w:hanging="360"/>
+      </w:pPr>
+    </w:lvl>
+    <w:lvl w:ilvl="3" w:tplc="621C22F4" w:tentative="1">
+      <w:start w:val="1"/>
+      <w:numFmt w:val="lowerLetter"/>
+      <w:lvlText w:val="(%4)"/>
+      <w:lvlJc w:val="left"/>
+      <w:pPr>
+        <w:tabs>
+          <w:tab w:val="num" w:pos="2880"/>
+        </w:tabs>
+        <w:ind w:left="2880" w:hanging="360"/>
+      </w:pPr>
+    </w:lvl>
+    <w:lvl w:ilvl="4" w:tplc="4E50AF76" w:tentative="1">
+      <w:start w:val="1"/>
+      <w:numFmt w:val="lowerLetter"/>
+      <w:lvlText w:val="(%5)"/>
+      <w:lvlJc w:val="left"/>
+      <w:pPr>
+        <w:tabs>
+          <w:tab w:val="num" w:pos="3600"/>
+        </w:tabs>
+        <w:ind w:left="3600" w:hanging="360"/>
+      </w:pPr>
+    </w:lvl>
+    <w:lvl w:ilvl="5" w:tplc="E306232A" w:tentative="1">
+      <w:start w:val="1"/>
+      <w:numFmt w:val="lowerLetter"/>
+      <w:lvlText w:val="(%6)"/>
+      <w:lvlJc w:val="left"/>
+      <w:pPr>
+        <w:tabs>
+          <w:tab w:val="num" w:pos="4320"/>
+        </w:tabs>
+        <w:ind w:left="4320" w:hanging="360"/>
+      </w:pPr>
+    </w:lvl>
+    <w:lvl w:ilvl="6" w:tplc="46BAC77E" w:tentative="1">
+      <w:start w:val="1"/>
+      <w:numFmt w:val="lowerLetter"/>
+      <w:lvlText w:val="(%7)"/>
+      <w:lvlJc w:val="left"/>
+      <w:pPr>
+        <w:tabs>
+          <w:tab w:val="num" w:pos="5040"/>
+        </w:tabs>
+        <w:ind w:left="5040" w:hanging="360"/>
+      </w:pPr>
+    </w:lvl>
+    <w:lvl w:ilvl="7" w:tplc="E7B8314E" w:tentative="1">
+      <w:start w:val="1"/>
+      <w:numFmt w:val="lowerLetter"/>
+      <w:lvlText w:val="(%8)"/>
+      <w:lvlJc w:val="left"/>
+      <w:pPr>
+        <w:tabs>
+          <w:tab w:val="num" w:pos="5760"/>
+        </w:tabs>
+        <w:ind w:left="5760" w:hanging="360"/>
+      </w:pPr>
+    </w:lvl>
+    <w:lvl w:ilvl="8" w:tplc="D75EE2B4" w:tentative="1">
+      <w:start w:val="1"/>
+      <w:numFmt w:val="lowerLetter"/>
+      <w:lvlText w:val="(%9)"/>
+      <w:lvlJc w:val="left"/>
+      <w:pPr>
+        <w:tabs>
+          <w:tab w:val="num" w:pos="6480"/>
+        </w:tabs>
+        <w:ind w:left="6480" w:hanging="360"/>
+      </w:pPr>
+    </w:lvl>
+  </w:abstractNum>
+  <w:abstractNum w:abstractNumId="25" w15:restartNumberingAfterBreak="0">
     <w:nsid w:val="3C8F7BD9"/>
     <w:multiLevelType w:val="multilevel"/>
     <w:tmpl w:val="28303A60"/>
@@ -24674,7 +27027,7 @@
       </w:rPr>
     </w:lvl>
   </w:abstractNum>
-  <w:abstractNum w:abstractNumId="25" w15:restartNumberingAfterBreak="0">
+  <w:abstractNum w:abstractNumId="26" w15:restartNumberingAfterBreak="0">
     <w:nsid w:val="3EC41AE9"/>
     <w:multiLevelType w:val="multilevel"/>
     <w:tmpl w:val="0AEA269C"/>
@@ -24823,7 +27176,7 @@
       </w:rPr>
     </w:lvl>
   </w:abstractNum>
-  <w:abstractNum w:abstractNumId="26" w15:restartNumberingAfterBreak="0">
+  <w:abstractNum w:abstractNumId="27" w15:restartNumberingAfterBreak="0">
     <w:nsid w:val="41BA32C0"/>
     <w:multiLevelType w:val="multilevel"/>
     <w:tmpl w:val="7C9CF01C"/>
@@ -24972,7 +27325,7 @@
       </w:rPr>
     </w:lvl>
   </w:abstractNum>
-  <w:abstractNum w:abstractNumId="27" w15:restartNumberingAfterBreak="0">
+  <w:abstractNum w:abstractNumId="28" w15:restartNumberingAfterBreak="0">
     <w:nsid w:val="427D7FD9"/>
     <w:multiLevelType w:val="multilevel"/>
     <w:tmpl w:val="0B38CE1C"/>
@@ -25085,7 +27438,7 @@
       </w:pPr>
     </w:lvl>
   </w:abstractNum>
-  <w:abstractNum w:abstractNumId="28" w15:restartNumberingAfterBreak="0">
+  <w:abstractNum w:abstractNumId="29" w15:restartNumberingAfterBreak="0">
     <w:nsid w:val="42AA3109"/>
     <w:multiLevelType w:val="multilevel"/>
     <w:tmpl w:val="C0B69F9A"/>
@@ -25234,7 +27587,7 @@
       </w:rPr>
     </w:lvl>
   </w:abstractNum>
-  <w:abstractNum w:abstractNumId="29" w15:restartNumberingAfterBreak="0">
+  <w:abstractNum w:abstractNumId="30" w15:restartNumberingAfterBreak="0">
     <w:nsid w:val="440A6A6D"/>
     <w:multiLevelType w:val="multilevel"/>
     <w:tmpl w:val="CCD48690"/>
@@ -25379,7 +27732,120 @@
       </w:rPr>
     </w:lvl>
   </w:abstractNum>
-  <w:abstractNum w:abstractNumId="30" w15:restartNumberingAfterBreak="0">
+  <w:abstractNum w:abstractNumId="31" w15:restartNumberingAfterBreak="0">
+    <w:nsid w:val="4B216A1E"/>
+    <w:multiLevelType w:val="hybridMultilevel"/>
+    <w:tmpl w:val="9EF22D2C"/>
+    <w:lvl w:ilvl="0" w:tplc="73B8BCC2">
+      <w:start w:val="1"/>
+      <w:numFmt w:val="lowerLetter"/>
+      <w:lvlText w:val="(%1)"/>
+      <w:lvlJc w:val="left"/>
+      <w:pPr>
+        <w:tabs>
+          <w:tab w:val="num" w:pos="720"/>
+        </w:tabs>
+        <w:ind w:left="720" w:hanging="360"/>
+      </w:pPr>
+    </w:lvl>
+    <w:lvl w:ilvl="1" w:tplc="E6669A28" w:tentative="1">
+      <w:start w:val="1"/>
+      <w:numFmt w:val="lowerLetter"/>
+      <w:lvlText w:val="(%2)"/>
+      <w:lvlJc w:val="left"/>
+      <w:pPr>
+        <w:tabs>
+          <w:tab w:val="num" w:pos="1440"/>
+        </w:tabs>
+        <w:ind w:left="1440" w:hanging="360"/>
+      </w:pPr>
+    </w:lvl>
+    <w:lvl w:ilvl="2" w:tplc="A0C2C6C0" w:tentative="1">
+      <w:start w:val="1"/>
+      <w:numFmt w:val="lowerLetter"/>
+      <w:lvlText w:val="(%3)"/>
+      <w:lvlJc w:val="left"/>
+      <w:pPr>
+        <w:tabs>
+          <w:tab w:val="num" w:pos="2160"/>
+        </w:tabs>
+        <w:ind w:left="2160" w:hanging="360"/>
+      </w:pPr>
+    </w:lvl>
+    <w:lvl w:ilvl="3" w:tplc="6EFE9064" w:tentative="1">
+      <w:start w:val="1"/>
+      <w:numFmt w:val="lowerLetter"/>
+      <w:lvlText w:val="(%4)"/>
+      <w:lvlJc w:val="left"/>
+      <w:pPr>
+        <w:tabs>
+          <w:tab w:val="num" w:pos="2880"/>
+        </w:tabs>
+        <w:ind w:left="2880" w:hanging="360"/>
+      </w:pPr>
+    </w:lvl>
+    <w:lvl w:ilvl="4" w:tplc="D3CAACDE" w:tentative="1">
+      <w:start w:val="1"/>
+      <w:numFmt w:val="lowerLetter"/>
+      <w:lvlText w:val="(%5)"/>
+      <w:lvlJc w:val="left"/>
+      <w:pPr>
+        <w:tabs>
+          <w:tab w:val="num" w:pos="3600"/>
+        </w:tabs>
+        <w:ind w:left="3600" w:hanging="360"/>
+      </w:pPr>
+    </w:lvl>
+    <w:lvl w:ilvl="5" w:tplc="68A4C14C" w:tentative="1">
+      <w:start w:val="1"/>
+      <w:numFmt w:val="lowerLetter"/>
+      <w:lvlText w:val="(%6)"/>
+      <w:lvlJc w:val="left"/>
+      <w:pPr>
+        <w:tabs>
+          <w:tab w:val="num" w:pos="4320"/>
+        </w:tabs>
+        <w:ind w:left="4320" w:hanging="360"/>
+      </w:pPr>
+    </w:lvl>
+    <w:lvl w:ilvl="6" w:tplc="15385BB2" w:tentative="1">
+      <w:start w:val="1"/>
+      <w:numFmt w:val="lowerLetter"/>
+      <w:lvlText w:val="(%7)"/>
+      <w:lvlJc w:val="left"/>
+      <w:pPr>
+        <w:tabs>
+          <w:tab w:val="num" w:pos="5040"/>
+        </w:tabs>
+        <w:ind w:left="5040" w:hanging="360"/>
+      </w:pPr>
+    </w:lvl>
+    <w:lvl w:ilvl="7" w:tplc="19D09784" w:tentative="1">
+      <w:start w:val="1"/>
+      <w:numFmt w:val="lowerLetter"/>
+      <w:lvlText w:val="(%8)"/>
+      <w:lvlJc w:val="left"/>
+      <w:pPr>
+        <w:tabs>
+          <w:tab w:val="num" w:pos="5760"/>
+        </w:tabs>
+        <w:ind w:left="5760" w:hanging="360"/>
+      </w:pPr>
+    </w:lvl>
+    <w:lvl w:ilvl="8" w:tplc="32F2FCA4" w:tentative="1">
+      <w:start w:val="1"/>
+      <w:numFmt w:val="lowerLetter"/>
+      <w:lvlText w:val="(%9)"/>
+      <w:lvlJc w:val="left"/>
+      <w:pPr>
+        <w:tabs>
+          <w:tab w:val="num" w:pos="6480"/>
+        </w:tabs>
+        <w:ind w:left="6480" w:hanging="360"/>
+      </w:pPr>
+    </w:lvl>
+  </w:abstractNum>
+  <w:abstractNum w:abstractNumId="32" w15:restartNumberingAfterBreak="0">
     <w:nsid w:val="4BC20C4B"/>
     <w:multiLevelType w:val="multilevel"/>
     <w:tmpl w:val="772C71E0"/>
@@ -25528,7 +27994,7 @@
       </w:rPr>
     </w:lvl>
   </w:abstractNum>
-  <w:abstractNum w:abstractNumId="31" w15:restartNumberingAfterBreak="0">
+  <w:abstractNum w:abstractNumId="33" w15:restartNumberingAfterBreak="0">
     <w:nsid w:val="4C1A351F"/>
     <w:multiLevelType w:val="multilevel"/>
     <w:tmpl w:val="2B222912"/>
@@ -25677,7 +28143,7 @@
       </w:rPr>
     </w:lvl>
   </w:abstractNum>
-  <w:abstractNum w:abstractNumId="32" w15:restartNumberingAfterBreak="0">
+  <w:abstractNum w:abstractNumId="34" w15:restartNumberingAfterBreak="0">
     <w:nsid w:val="4C62180C"/>
     <w:multiLevelType w:val="multilevel"/>
     <w:tmpl w:val="943EAC9A"/>
@@ -25826,7 +28292,7 @@
       </w:rPr>
     </w:lvl>
   </w:abstractNum>
-  <w:abstractNum w:abstractNumId="33" w15:restartNumberingAfterBreak="0">
+  <w:abstractNum w:abstractNumId="35" w15:restartNumberingAfterBreak="0">
     <w:nsid w:val="523F0B0A"/>
     <w:multiLevelType w:val="multilevel"/>
     <w:tmpl w:val="4F8E7CFA"/>
@@ -25946,7 +28412,7 @@
       </w:pPr>
     </w:lvl>
   </w:abstractNum>
-  <w:abstractNum w:abstractNumId="34" w15:restartNumberingAfterBreak="0">
+  <w:abstractNum w:abstractNumId="36" w15:restartNumberingAfterBreak="0">
     <w:nsid w:val="52583EFE"/>
     <w:multiLevelType w:val="multilevel"/>
     <w:tmpl w:val="C128C7EE"/>
@@ -26095,7 +28561,7 @@
       </w:rPr>
     </w:lvl>
   </w:abstractNum>
-  <w:abstractNum w:abstractNumId="35" w15:restartNumberingAfterBreak="0">
+  <w:abstractNum w:abstractNumId="37" w15:restartNumberingAfterBreak="0">
     <w:nsid w:val="548A7011"/>
     <w:multiLevelType w:val="multilevel"/>
     <w:tmpl w:val="FD6A6722"/>
@@ -26244,7 +28710,7 @@
       </w:rPr>
     </w:lvl>
   </w:abstractNum>
-  <w:abstractNum w:abstractNumId="36" w15:restartNumberingAfterBreak="0">
+  <w:abstractNum w:abstractNumId="38" w15:restartNumberingAfterBreak="0">
     <w:nsid w:val="54DD6B1E"/>
     <w:multiLevelType w:val="multilevel"/>
     <w:tmpl w:val="6FF478A4"/>
@@ -26393,7 +28859,7 @@
       </w:rPr>
     </w:lvl>
   </w:abstractNum>
-  <w:abstractNum w:abstractNumId="37" w15:restartNumberingAfterBreak="0">
+  <w:abstractNum w:abstractNumId="39" w15:restartNumberingAfterBreak="0">
     <w:nsid w:val="5DD57E74"/>
     <w:multiLevelType w:val="multilevel"/>
     <w:tmpl w:val="C7E2A81A"/>
@@ -26510,7 +28976,7 @@
       </w:pPr>
     </w:lvl>
   </w:abstractNum>
-  <w:abstractNum w:abstractNumId="38" w15:restartNumberingAfterBreak="0">
+  <w:abstractNum w:abstractNumId="40" w15:restartNumberingAfterBreak="0">
     <w:nsid w:val="63BB4B98"/>
     <w:multiLevelType w:val="multilevel"/>
     <w:tmpl w:val="818A320A"/>
@@ -26659,7 +29125,7 @@
       </w:rPr>
     </w:lvl>
   </w:abstractNum>
-  <w:abstractNum w:abstractNumId="39" w15:restartNumberingAfterBreak="0">
+  <w:abstractNum w:abstractNumId="41" w15:restartNumberingAfterBreak="0">
     <w:nsid w:val="64C053A5"/>
     <w:multiLevelType w:val="multilevel"/>
     <w:tmpl w:val="398AC3BE"/>
@@ -26808,7 +29274,7 @@
       </w:rPr>
     </w:lvl>
   </w:abstractNum>
-  <w:abstractNum w:abstractNumId="40" w15:restartNumberingAfterBreak="0">
+  <w:abstractNum w:abstractNumId="42" w15:restartNumberingAfterBreak="0">
     <w:nsid w:val="66D671F2"/>
     <w:multiLevelType w:val="multilevel"/>
     <w:tmpl w:val="4DF87650"/>
@@ -26957,7 +29423,7 @@
       </w:rPr>
     </w:lvl>
   </w:abstractNum>
-  <w:abstractNum w:abstractNumId="41" w15:restartNumberingAfterBreak="0">
+  <w:abstractNum w:abstractNumId="43" w15:restartNumberingAfterBreak="0">
     <w:nsid w:val="6A8A7752"/>
     <w:multiLevelType w:val="multilevel"/>
     <w:tmpl w:val="C6B6CE42"/>
@@ -27106,7 +29572,7 @@
       </w:rPr>
     </w:lvl>
   </w:abstractNum>
-  <w:abstractNum w:abstractNumId="42" w15:restartNumberingAfterBreak="0">
+  <w:abstractNum w:abstractNumId="44" w15:restartNumberingAfterBreak="0">
     <w:nsid w:val="6D226EA0"/>
     <w:multiLevelType w:val="multilevel"/>
     <w:tmpl w:val="77CADB04"/>
@@ -27255,7 +29721,7 @@
       </w:rPr>
     </w:lvl>
   </w:abstractNum>
-  <w:abstractNum w:abstractNumId="43" w15:restartNumberingAfterBreak="0">
+  <w:abstractNum w:abstractNumId="45" w15:restartNumberingAfterBreak="0">
     <w:nsid w:val="6FEE44A2"/>
     <w:multiLevelType w:val="multilevel"/>
     <w:tmpl w:val="8D1875BA"/>
@@ -27404,7 +29870,7 @@
       </w:rPr>
     </w:lvl>
   </w:abstractNum>
-  <w:abstractNum w:abstractNumId="44" w15:restartNumberingAfterBreak="0">
+  <w:abstractNum w:abstractNumId="46" w15:restartNumberingAfterBreak="0">
     <w:nsid w:val="700E1F88"/>
     <w:multiLevelType w:val="multilevel"/>
     <w:tmpl w:val="D588479C"/>
@@ -27553,7 +30019,7 @@
       </w:rPr>
     </w:lvl>
   </w:abstractNum>
-  <w:abstractNum w:abstractNumId="45" w15:restartNumberingAfterBreak="0">
+  <w:abstractNum w:abstractNumId="47" w15:restartNumberingAfterBreak="0">
     <w:nsid w:val="74121DA4"/>
     <w:multiLevelType w:val="multilevel"/>
     <w:tmpl w:val="B3E4B62C"/>
@@ -27702,7 +30168,7 @@
       </w:rPr>
     </w:lvl>
   </w:abstractNum>
-  <w:abstractNum w:abstractNumId="46" w15:restartNumberingAfterBreak="0">
+  <w:abstractNum w:abstractNumId="48" w15:restartNumberingAfterBreak="0">
     <w:nsid w:val="75EA748C"/>
     <w:multiLevelType w:val="hybridMultilevel"/>
     <w:tmpl w:val="0EA8C43A"/>
@@ -27791,7 +30257,7 @@
       </w:pPr>
     </w:lvl>
   </w:abstractNum>
-  <w:abstractNum w:abstractNumId="47" w15:restartNumberingAfterBreak="0">
+  <w:abstractNum w:abstractNumId="49" w15:restartNumberingAfterBreak="0">
     <w:nsid w:val="766D09A4"/>
     <w:multiLevelType w:val="hybridMultilevel"/>
     <w:tmpl w:val="031A4064"/>
@@ -27904,7 +30370,7 @@
       </w:rPr>
     </w:lvl>
   </w:abstractNum>
-  <w:abstractNum w:abstractNumId="48" w15:restartNumberingAfterBreak="0">
+  <w:abstractNum w:abstractNumId="50" w15:restartNumberingAfterBreak="0">
     <w:nsid w:val="76BA203B"/>
     <w:multiLevelType w:val="multilevel"/>
     <w:tmpl w:val="6714DE20"/>
@@ -28053,7 +30519,7 @@
       </w:rPr>
     </w:lvl>
   </w:abstractNum>
-  <w:abstractNum w:abstractNumId="49" w15:restartNumberingAfterBreak="0">
+  <w:abstractNum w:abstractNumId="51" w15:restartNumberingAfterBreak="0">
     <w:nsid w:val="799633F7"/>
     <w:multiLevelType w:val="multilevel"/>
     <w:tmpl w:val="9BE057D8"/>
@@ -28202,7 +30668,7 @@
       </w:rPr>
     </w:lvl>
   </w:abstractNum>
-  <w:abstractNum w:abstractNumId="50" w15:restartNumberingAfterBreak="0">
+  <w:abstractNum w:abstractNumId="52" w15:restartNumberingAfterBreak="0">
     <w:nsid w:val="7A1F50D3"/>
     <w:multiLevelType w:val="multilevel"/>
     <w:tmpl w:val="F13AE924"/>
@@ -28351,7 +30817,7 @@
       </w:rPr>
     </w:lvl>
   </w:abstractNum>
-  <w:abstractNum w:abstractNumId="51" w15:restartNumberingAfterBreak="0">
+  <w:abstractNum w:abstractNumId="53" w15:restartNumberingAfterBreak="0">
     <w:nsid w:val="7A821973"/>
     <w:multiLevelType w:val="multilevel"/>
     <w:tmpl w:val="FEE4FF42"/>
@@ -28500,7 +30966,7 @@
       </w:rPr>
     </w:lvl>
   </w:abstractNum>
-  <w:abstractNum w:abstractNumId="52" w15:restartNumberingAfterBreak="0">
+  <w:abstractNum w:abstractNumId="54" w15:restartNumberingAfterBreak="0">
     <w:nsid w:val="7B6E6D62"/>
     <w:multiLevelType w:val="multilevel"/>
     <w:tmpl w:val="27FEB4FA"/>
@@ -28649,7 +31115,7 @@
       </w:rPr>
     </w:lvl>
   </w:abstractNum>
-  <w:abstractNum w:abstractNumId="53" w15:restartNumberingAfterBreak="0">
+  <w:abstractNum w:abstractNumId="55" w15:restartNumberingAfterBreak="0">
     <w:nsid w:val="7C192A48"/>
     <w:multiLevelType w:val="multilevel"/>
     <w:tmpl w:val="6B8EB274"/>
@@ -28798,7 +31264,7 @@
       </w:rPr>
     </w:lvl>
   </w:abstractNum>
-  <w:abstractNum w:abstractNumId="54" w15:restartNumberingAfterBreak="0">
+  <w:abstractNum w:abstractNumId="56" w15:restartNumberingAfterBreak="0">
     <w:nsid w:val="7C790F7E"/>
     <w:multiLevelType w:val="multilevel"/>
     <w:tmpl w:val="0B923DB2"/>
@@ -28947,7 +31413,7 @@
       </w:rPr>
     </w:lvl>
   </w:abstractNum>
-  <w:abstractNum w:abstractNumId="55" w15:restartNumberingAfterBreak="0">
+  <w:abstractNum w:abstractNumId="57" w15:restartNumberingAfterBreak="0">
     <w:nsid w:val="7D730B34"/>
     <w:multiLevelType w:val="multilevel"/>
     <w:tmpl w:val="EC2619CA"/>
@@ -29096,7 +31562,7 @@
       </w:rPr>
     </w:lvl>
   </w:abstractNum>
-  <w:abstractNum w:abstractNumId="56" w15:restartNumberingAfterBreak="0">
+  <w:abstractNum w:abstractNumId="58" w15:restartNumberingAfterBreak="0">
     <w:nsid w:val="7FE249EC"/>
     <w:multiLevelType w:val="multilevel"/>
     <w:tmpl w:val="6FACB090"/>
@@ -29264,28 +31730,28 @@
     <w:abstractNumId w:val="0"/>
   </w:num>
   <w:num w:numId="7" w16cid:durableId="993339737">
-    <w:abstractNumId w:val="46"/>
+    <w:abstractNumId w:val="48"/>
   </w:num>
   <w:num w:numId="8" w16cid:durableId="1330255837">
-    <w:abstractNumId w:val="36"/>
+    <w:abstractNumId w:val="38"/>
   </w:num>
   <w:num w:numId="9" w16cid:durableId="2061198404">
-    <w:abstractNumId w:val="33"/>
+    <w:abstractNumId w:val="35"/>
   </w:num>
   <w:num w:numId="10" w16cid:durableId="1342706138">
-    <w:abstractNumId w:val="29"/>
+    <w:abstractNumId w:val="30"/>
   </w:num>
   <w:num w:numId="11" w16cid:durableId="1725136729">
     <w:abstractNumId w:val="16"/>
   </w:num>
   <w:num w:numId="12" w16cid:durableId="1058551818">
-    <w:abstractNumId w:val="52"/>
+    <w:abstractNumId w:val="54"/>
   </w:num>
   <w:num w:numId="13" w16cid:durableId="16590923">
     <w:abstractNumId w:val="15"/>
   </w:num>
   <w:num w:numId="14" w16cid:durableId="1469934208">
-    <w:abstractNumId w:val="37"/>
+    <w:abstractNumId w:val="39"/>
   </w:num>
   <w:num w:numId="15" w16cid:durableId="522984202">
     <w:abstractNumId w:val="9"/>
@@ -29294,25 +31760,25 @@
     <w:abstractNumId w:val="13"/>
   </w:num>
   <w:num w:numId="17" w16cid:durableId="1994025315">
-    <w:abstractNumId w:val="24"/>
+    <w:abstractNumId w:val="25"/>
   </w:num>
   <w:num w:numId="18" w16cid:durableId="2135173357">
-    <w:abstractNumId w:val="30"/>
+    <w:abstractNumId w:val="32"/>
   </w:num>
   <w:num w:numId="19" w16cid:durableId="1311596985">
-    <w:abstractNumId w:val="27"/>
+    <w:abstractNumId w:val="28"/>
   </w:num>
   <w:num w:numId="20" w16cid:durableId="894125143">
-    <w:abstractNumId w:val="28"/>
+    <w:abstractNumId w:val="29"/>
   </w:num>
   <w:num w:numId="21" w16cid:durableId="1691760338">
-    <w:abstractNumId w:val="55"/>
+    <w:abstractNumId w:val="57"/>
   </w:num>
   <w:num w:numId="22" w16cid:durableId="312491725">
-    <w:abstractNumId w:val="32"/>
+    <w:abstractNumId w:val="34"/>
   </w:num>
   <w:num w:numId="23" w16cid:durableId="129055794">
-    <w:abstractNumId w:val="48"/>
+    <w:abstractNumId w:val="50"/>
   </w:num>
   <w:num w:numId="24" w16cid:durableId="85156206">
     <w:abstractNumId w:val="23"/>
@@ -29324,28 +31790,28 @@
     <w:abstractNumId w:val="7"/>
   </w:num>
   <w:num w:numId="27" w16cid:durableId="2113819614">
-    <w:abstractNumId w:val="43"/>
+    <w:abstractNumId w:val="45"/>
   </w:num>
   <w:num w:numId="28" w16cid:durableId="1659117505">
-    <w:abstractNumId w:val="39"/>
+    <w:abstractNumId w:val="41"/>
   </w:num>
   <w:num w:numId="29" w16cid:durableId="956567806">
-    <w:abstractNumId w:val="25"/>
+    <w:abstractNumId w:val="26"/>
   </w:num>
   <w:num w:numId="30" w16cid:durableId="1019623934">
-    <w:abstractNumId w:val="53"/>
+    <w:abstractNumId w:val="55"/>
   </w:num>
   <w:num w:numId="31" w16cid:durableId="787823418">
-    <w:abstractNumId w:val="45"/>
+    <w:abstractNumId w:val="47"/>
   </w:num>
   <w:num w:numId="32" w16cid:durableId="1551070644">
-    <w:abstractNumId w:val="42"/>
+    <w:abstractNumId w:val="44"/>
   </w:num>
   <w:num w:numId="33" w16cid:durableId="984972615">
-    <w:abstractNumId w:val="49"/>
+    <w:abstractNumId w:val="51"/>
   </w:num>
   <w:num w:numId="34" w16cid:durableId="1386223595">
-    <w:abstractNumId w:val="34"/>
+    <w:abstractNumId w:val="36"/>
   </w:num>
   <w:num w:numId="35" w16cid:durableId="135879195">
     <w:abstractNumId w:val="20"/>
@@ -29354,22 +31820,22 @@
     <w:abstractNumId w:val="14"/>
   </w:num>
   <w:num w:numId="37" w16cid:durableId="307899614">
-    <w:abstractNumId w:val="38"/>
+    <w:abstractNumId w:val="40"/>
   </w:num>
   <w:num w:numId="38" w16cid:durableId="1957326659">
-    <w:abstractNumId w:val="31"/>
+    <w:abstractNumId w:val="33"/>
   </w:num>
   <w:num w:numId="39" w16cid:durableId="1920753049">
-    <w:abstractNumId w:val="26"/>
+    <w:abstractNumId w:val="27"/>
   </w:num>
   <w:num w:numId="40" w16cid:durableId="1506090385">
-    <w:abstractNumId w:val="50"/>
+    <w:abstractNumId w:val="52"/>
   </w:num>
   <w:num w:numId="41" w16cid:durableId="1707682768">
     <w:abstractNumId w:val="22"/>
   </w:num>
   <w:num w:numId="42" w16cid:durableId="583345737">
-    <w:abstractNumId w:val="47"/>
+    <w:abstractNumId w:val="49"/>
   </w:num>
   <w:num w:numId="43" w16cid:durableId="1030766802">
     <w:abstractNumId w:val="8"/>
@@ -29378,7 +31844,7 @@
     <w:abstractNumId w:val="17"/>
   </w:num>
   <w:num w:numId="45" w16cid:durableId="1841777377">
-    <w:abstractNumId w:val="35"/>
+    <w:abstractNumId w:val="37"/>
   </w:num>
   <w:num w:numId="46" w16cid:durableId="994336871">
     <w:abstractNumId w:val="6"/>
@@ -29387,10 +31853,10 @@
     <w:abstractNumId w:val="19"/>
   </w:num>
   <w:num w:numId="48" w16cid:durableId="918174720">
-    <w:abstractNumId w:val="41"/>
+    <w:abstractNumId w:val="43"/>
   </w:num>
   <w:num w:numId="49" w16cid:durableId="1285621998">
-    <w:abstractNumId w:val="44"/>
+    <w:abstractNumId w:val="46"/>
   </w:num>
   <w:num w:numId="50" w16cid:durableId="1861580442">
     <w:abstractNumId w:val="21"/>
@@ -29399,22 +31865,28 @@
     <w:abstractNumId w:val="18"/>
   </w:num>
   <w:num w:numId="52" w16cid:durableId="373702201">
-    <w:abstractNumId w:val="54"/>
+    <w:abstractNumId w:val="56"/>
   </w:num>
   <w:num w:numId="53" w16cid:durableId="357196570">
-    <w:abstractNumId w:val="51"/>
+    <w:abstractNumId w:val="53"/>
   </w:num>
   <w:num w:numId="54" w16cid:durableId="1957129948">
     <w:abstractNumId w:val="11"/>
   </w:num>
   <w:num w:numId="55" w16cid:durableId="487673919">
-    <w:abstractNumId w:val="56"/>
+    <w:abstractNumId w:val="58"/>
   </w:num>
   <w:num w:numId="56" w16cid:durableId="960962425">
-    <w:abstractNumId w:val="40"/>
+    <w:abstractNumId w:val="42"/>
   </w:num>
   <w:num w:numId="57" w16cid:durableId="1627854804">
     <w:abstractNumId w:val="10"/>
+  </w:num>
+  <w:num w:numId="58" w16cid:durableId="1249196509">
+    <w:abstractNumId w:val="24"/>
+  </w:num>
+  <w:num w:numId="59" w16cid:durableId="1888056774">
+    <w:abstractNumId w:val="31"/>
   </w:num>
   <w:numIdMacAtCleanup w:val="47"/>
 </w:numbering>

</xml_diff>